<commit_message>
Slight reformatting of link
</commit_message>
<xml_diff>
--- a/docassemble/HousingCodeChecklist/data/templates/next_steps_inspection_request_letter.docx
+++ b/docassemble/HousingCodeChecklist/data/templates/next_steps_inspection_request_letter.docx
@@ -1,6 +1,6 @@
 
 <file path=word/document.xml><?xml version="1.0" encoding="utf-8"?>
-<w:document xmlns:wpc="http://schemas.microsoft.com/office/word/2010/wordprocessingCanvas" xmlns:cx="http://schemas.microsoft.com/office/drawing/2014/chartex" xmlns:cx1="http://schemas.microsoft.com/office/drawing/2015/9/8/chartex" xmlns:cx2="http://schemas.microsoft.com/office/drawing/2015/10/21/chartex" xmlns:cx3="http://schemas.microsoft.com/office/drawing/2016/5/9/chartex" xmlns:cx4="http://schemas.microsoft.com/office/drawing/2016/5/10/chartex" xmlns:cx5="http://schemas.microsoft.com/office/drawing/2016/5/11/chartex" xmlns:cx6="http://schemas.microsoft.com/office/drawing/2016/5/12/chartex" xmlns:cx7="http://schemas.microsoft.com/office/drawing/2016/5/13/chartex" xmlns:cx8="http://schemas.microsoft.com/office/drawing/2016/5/14/chartex" xmlns:mc="http://schemas.openxmlformats.org/markup-compatibility/2006" xmlns:aink="http://schemas.microsoft.com/office/drawing/2016/ink" xmlns:am3d="http://schemas.microsoft.com/office/drawing/2017/model3d" xmlns:o="urn:schemas-microsoft-com:office:office" xmlns:oel="http://schemas.microsoft.com/office/2019/extlst" xmlns:r="http://schemas.openxmlformats.org/officeDocument/2006/relationships" xmlns:m="http://schemas.openxmlformats.org/officeDocument/2006/math" xmlns:v="urn:schemas-microsoft-com:vml" xmlns:wp14="http://schemas.microsoft.com/office/word/2010/wordprocessingDrawing" xmlns:wp="http://schemas.openxmlformats.org/drawingml/2006/wordprocessingDrawing" xmlns:w10="urn:schemas-microsoft-com:office:word" xmlns:w="http://schemas.openxmlformats.org/wordprocessingml/2006/main" xmlns:w14="http://schemas.microsoft.com/office/word/2010/wordml" xmlns:w15="http://schemas.microsoft.com/office/word/2012/wordml" xmlns:w16cex="http://schemas.microsoft.com/office/word/2018/wordml/cex" xmlns:w16cid="http://schemas.microsoft.com/office/word/2016/wordml/cid" xmlns:w16="http://schemas.microsoft.com/office/word/2018/wordml" xmlns:w16du="http://schemas.microsoft.com/office/word/2023/wordml/word16du" xmlns:w16sdtdh="http://schemas.microsoft.com/office/word/2020/wordml/sdtdatahash" xmlns:w16sdtfl="http://schemas.microsoft.com/office/word/2024/wordml/sdtformatlock" xmlns:w16se="http://schemas.microsoft.com/office/word/2015/wordml/symex" xmlns:wpg="http://schemas.microsoft.com/office/word/2010/wordprocessingGroup" xmlns:wpi="http://schemas.microsoft.com/office/word/2010/wordprocessingInk" xmlns:wne="http://schemas.microsoft.com/office/word/2006/wordml" xmlns:wps="http://schemas.microsoft.com/office/word/2010/wordprocessingShape" mc:Ignorable="w14 w15 w16se w16cid w16 w16cex w16sdtdh w16sdtfl w16du wp14">
+<w:document xmlns:wpc="http://schemas.microsoft.com/office/word/2010/wordprocessingCanvas" xmlns:cx="http://schemas.microsoft.com/office/drawing/2014/chartex" xmlns:cx1="http://schemas.microsoft.com/office/drawing/2015/9/8/chartex" xmlns:cx2="http://schemas.microsoft.com/office/drawing/2015/10/21/chartex" xmlns:cx3="http://schemas.microsoft.com/office/drawing/2016/5/9/chartex" xmlns:cx4="http://schemas.microsoft.com/office/drawing/2016/5/10/chartex" xmlns:cx5="http://schemas.microsoft.com/office/drawing/2016/5/11/chartex" xmlns:cx6="http://schemas.microsoft.com/office/drawing/2016/5/12/chartex" xmlns:cx7="http://schemas.microsoft.com/office/drawing/2016/5/13/chartex" xmlns:cx8="http://schemas.microsoft.com/office/drawing/2016/5/14/chartex" xmlns:mc="http://schemas.openxmlformats.org/markup-compatibility/2006" xmlns:aink="http://schemas.microsoft.com/office/drawing/2016/ink" xmlns:am3d="http://schemas.microsoft.com/office/drawing/2017/model3d" xmlns:o="urn:schemas-microsoft-com:office:office" xmlns:oel="http://schemas.microsoft.com/office/2019/extlst" xmlns:r="http://schemas.openxmlformats.org/officeDocument/2006/relationships" xmlns:m="http://schemas.openxmlformats.org/officeDocument/2006/math" xmlns:v="urn:schemas-microsoft-com:vml" xmlns:wp14="http://schemas.microsoft.com/office/word/2010/wordprocessingDrawing" xmlns:wp="http://schemas.openxmlformats.org/drawingml/2006/wordprocessingDrawing" xmlns:w10="urn:schemas-microsoft-com:office:word" xmlns:w="http://schemas.openxmlformats.org/wordprocessingml/2006/main" xmlns:w14="http://schemas.microsoft.com/office/word/2010/wordml" xmlns:w15="http://schemas.microsoft.com/office/word/2012/wordml" xmlns:w16cex="http://schemas.microsoft.com/office/word/2018/wordml/cex" xmlns:w16cid="http://schemas.microsoft.com/office/word/2016/wordml/cid" xmlns:w16="http://schemas.microsoft.com/office/word/2018/wordml" xmlns:w16du="http://schemas.microsoft.com/office/word/2023/wordml/word16du" xmlns:w16sdtdh="http://schemas.microsoft.com/office/word/2020/wordml/sdtdatahash" xmlns:w16se="http://schemas.microsoft.com/office/word/2015/wordml/symex" xmlns:wpg="http://schemas.microsoft.com/office/word/2010/wordprocessingGroup" xmlns:wpi="http://schemas.microsoft.com/office/word/2010/wordprocessingInk" xmlns:wne="http://schemas.microsoft.com/office/word/2006/wordml" xmlns:wps="http://schemas.microsoft.com/office/word/2010/wordprocessingShape" mc:Ignorable="w14 w15 w16se w16cid w16 w16cex w16sdtdh w16du wp14">
   <w:body>
     <w:p>
       <w:pPr>
@@ -176,9 +176,8 @@
             <w14:bevel/>
           </w14:textOutline>
         </w:rPr>
-        <w:t xml:space="preserve">{% if </w:t>
-      </w:r>
-      <w:proofErr w:type="spellStart"/>
+        <w:t>{% if direct_inspection_email and direct_inspection_email_success %}</w:t>
+      </w:r>
       <w:r>
         <w:rPr>
           <w:rFonts w:cstheme="minorHAnsi"/>
@@ -188,9 +187,8 @@
             <w14:bevel/>
           </w14:textOutline>
         </w:rPr>
-        <w:t>direct_inspection_email</w:t>
-      </w:r>
-      <w:proofErr w:type="spellEnd"/>
+        <w:t>Your request for an inspection has already been emailed directly to Chelsea Inspectional Services.</w:t>
+      </w:r>
       <w:r>
         <w:rPr>
           <w:rFonts w:cstheme="minorHAnsi"/>
@@ -200,9 +198,8 @@
             <w14:bevel/>
           </w14:textOutline>
         </w:rPr>
-        <w:t xml:space="preserve"> and </w:t>
-      </w:r>
-      <w:proofErr w:type="spellStart"/>
+        <w:t>{% else %}</w:t>
+      </w:r>
       <w:r>
         <w:rPr>
           <w:rFonts w:cstheme="minorHAnsi"/>
@@ -212,9 +209,8 @@
             <w14:bevel/>
           </w14:textOutline>
         </w:rPr>
-        <w:t>direct_inspection_email_success</w:t>
-      </w:r>
-      <w:proofErr w:type="spellEnd"/>
+        <w:t>Decide if you want to call the inspector or mail in your letter. Most tenants call because it gets a faster response</w:t>
+      </w:r>
       <w:r>
         <w:rPr>
           <w:rFonts w:cstheme="minorHAnsi"/>
@@ -224,9 +220,8 @@
             <w14:bevel/>
           </w14:textOutline>
         </w:rPr>
-        <w:t xml:space="preserve"> </w:t>
-      </w:r>
-      <w:proofErr w:type="gramStart"/>
+        <w:t>.</w:t>
+      </w:r>
       <w:r>
         <w:rPr>
           <w:rFonts w:cstheme="minorHAnsi"/>
@@ -236,146 +231,7 @@
             <w14:bevel/>
           </w14:textOutline>
         </w:rPr>
-        <w:t>%}</w:t>
-      </w:r>
-      <w:r>
-        <w:rPr>
-          <w:rFonts w:cstheme="minorHAnsi"/>
-          <w14:textOutline w14:w="9525" w14:cap="rnd" w14:cmpd="sng" w14:algn="ctr">
-            <w14:noFill/>
-            <w14:prstDash w14:val="solid"/>
-            <w14:bevel/>
-          </w14:textOutline>
-        </w:rPr>
-        <w:t>Your</w:t>
-      </w:r>
-      <w:proofErr w:type="gramEnd"/>
-      <w:r>
-        <w:rPr>
-          <w:rFonts w:cstheme="minorHAnsi"/>
-          <w14:textOutline w14:w="9525" w14:cap="rnd" w14:cmpd="sng" w14:algn="ctr">
-            <w14:noFill/>
-            <w14:prstDash w14:val="solid"/>
-            <w14:bevel/>
-          </w14:textOutline>
-        </w:rPr>
-        <w:t xml:space="preserve"> request for an inspection has already been emailed directly to Chelsea Inspectional </w:t>
-      </w:r>
-      <w:proofErr w:type="gramStart"/>
-      <w:r>
-        <w:rPr>
-          <w:rFonts w:cstheme="minorHAnsi"/>
-          <w14:textOutline w14:w="9525" w14:cap="rnd" w14:cmpd="sng" w14:algn="ctr">
-            <w14:noFill/>
-            <w14:prstDash w14:val="solid"/>
-            <w14:bevel/>
-          </w14:textOutline>
-        </w:rPr>
-        <w:t>Services.</w:t>
-      </w:r>
-      <w:r>
-        <w:rPr>
-          <w:rFonts w:cstheme="minorHAnsi"/>
-          <w14:textOutline w14:w="9525" w14:cap="rnd" w14:cmpd="sng" w14:algn="ctr">
-            <w14:noFill/>
-            <w14:prstDash w14:val="solid"/>
-            <w14:bevel/>
-          </w14:textOutline>
-        </w:rPr>
-        <w:t>{</w:t>
-      </w:r>
-      <w:proofErr w:type="gramEnd"/>
-      <w:r>
-        <w:rPr>
-          <w:rFonts w:cstheme="minorHAnsi"/>
-          <w14:textOutline w14:w="9525" w14:cap="rnd" w14:cmpd="sng" w14:algn="ctr">
-            <w14:noFill/>
-            <w14:prstDash w14:val="solid"/>
-            <w14:bevel/>
-          </w14:textOutline>
-        </w:rPr>
-        <w:t xml:space="preserve">% else </w:t>
-      </w:r>
-      <w:proofErr w:type="gramStart"/>
-      <w:r>
-        <w:rPr>
-          <w:rFonts w:cstheme="minorHAnsi"/>
-          <w14:textOutline w14:w="9525" w14:cap="rnd" w14:cmpd="sng" w14:algn="ctr">
-            <w14:noFill/>
-            <w14:prstDash w14:val="solid"/>
-            <w14:bevel/>
-          </w14:textOutline>
-        </w:rPr>
-        <w:t>%}</w:t>
-      </w:r>
-      <w:r>
-        <w:rPr>
-          <w:rFonts w:cstheme="minorHAnsi"/>
-          <w14:textOutline w14:w="9525" w14:cap="rnd" w14:cmpd="sng" w14:algn="ctr">
-            <w14:noFill/>
-            <w14:prstDash w14:val="solid"/>
-            <w14:bevel/>
-          </w14:textOutline>
-        </w:rPr>
-        <w:t>Decide</w:t>
-      </w:r>
-      <w:proofErr w:type="gramEnd"/>
-      <w:r>
-        <w:rPr>
-          <w:rFonts w:cstheme="minorHAnsi"/>
-          <w14:textOutline w14:w="9525" w14:cap="rnd" w14:cmpd="sng" w14:algn="ctr">
-            <w14:noFill/>
-            <w14:prstDash w14:val="solid"/>
-            <w14:bevel/>
-          </w14:textOutline>
-        </w:rPr>
-        <w:t xml:space="preserve"> if you want to call the inspector or mail in your letter. Most tenants call because it gets a faster </w:t>
-      </w:r>
-      <w:proofErr w:type="gramStart"/>
-      <w:r>
-        <w:rPr>
-          <w:rFonts w:cstheme="minorHAnsi"/>
-          <w14:textOutline w14:w="9525" w14:cap="rnd" w14:cmpd="sng" w14:algn="ctr">
-            <w14:noFill/>
-            <w14:prstDash w14:val="solid"/>
-            <w14:bevel/>
-          </w14:textOutline>
-        </w:rPr>
-        <w:t>response</w:t>
-      </w:r>
-      <w:r>
-        <w:rPr>
-          <w:rFonts w:cstheme="minorHAnsi"/>
-          <w14:textOutline w14:w="9525" w14:cap="rnd" w14:cmpd="sng" w14:algn="ctr">
-            <w14:noFill/>
-            <w14:prstDash w14:val="solid"/>
-            <w14:bevel/>
-          </w14:textOutline>
-        </w:rPr>
-        <w:t>.</w:t>
-      </w:r>
-      <w:r>
-        <w:rPr>
-          <w:rFonts w:cstheme="minorHAnsi"/>
-          <w14:textOutline w14:w="9525" w14:cap="rnd" w14:cmpd="sng" w14:algn="ctr">
-            <w14:noFill/>
-            <w14:prstDash w14:val="solid"/>
-            <w14:bevel/>
-          </w14:textOutline>
-        </w:rPr>
-        <w:t>{</w:t>
-      </w:r>
-      <w:proofErr w:type="gramEnd"/>
-      <w:r>
-        <w:rPr>
-          <w:rFonts w:cstheme="minorHAnsi"/>
-          <w14:textOutline w14:w="9525" w14:cap="rnd" w14:cmpd="sng" w14:algn="ctr">
-            <w14:noFill/>
-            <w14:prstDash w14:val="solid"/>
-            <w14:bevel/>
-          </w14:textOutline>
-        </w:rPr>
-        <w:t>% endif %}</w:t>
+        <w:t>{% endif %}</w:t>
       </w:r>
     </w:p>
     <w:p>
@@ -409,7 +265,23 @@
         </w:rPr>
         <w:t xml:space="preserve">You may be able to learn more on the City’s website: </w:t>
       </w:r>
-      <w:proofErr w:type="gramStart"/>
+    </w:p>
+    <w:p>
+      <w:pPr>
+        <w:pStyle w:val="ListParagraph"/>
+        <w:spacing w:after="80" w:line="240" w:lineRule="auto"/>
+        <w:ind w:left="360"/>
+        <w:rPr>
+          <w:rFonts w:cstheme="minorHAnsi"/>
+          <w:b/>
+          <w:bCs/>
+          <w14:textOutline w14:w="9525" w14:cap="rnd" w14:cmpd="sng" w14:algn="ctr">
+            <w14:noFill/>
+            <w14:prstDash w14:val="solid"/>
+            <w14:bevel/>
+          </w14:textOutline>
+        </w:rPr>
+      </w:pPr>
       <w:r>
         <w:rPr>
           <w:rFonts w:cstheme="minorHAnsi"/>
@@ -420,9 +292,8 @@
             <w14:bevel/>
           </w14:textOutline>
         </w:rPr>
-        <w:t xml:space="preserve">{{ </w:t>
-      </w:r>
-      <w:proofErr w:type="spellStart"/>
+        <w:t>{{ inspector_information["URL"] }}</w:t>
+      </w:r>
       <w:r>
         <w:rPr>
           <w:rFonts w:cstheme="minorHAnsi"/>
@@ -433,97 +304,7 @@
             <w14:bevel/>
           </w14:textOutline>
         </w:rPr>
-        <w:t>inspector</w:t>
-      </w:r>
-      <w:proofErr w:type="gramEnd"/>
-      <w:r>
-        <w:rPr>
-          <w:rFonts w:cstheme="minorHAnsi"/>
-          <w:bCs/>
-          <w14:textOutline w14:w="9525" w14:cap="rnd" w14:cmpd="sng" w14:algn="ctr">
-            <w14:noFill/>
-            <w14:prstDash w14:val="solid"/>
-            <w14:bevel/>
-          </w14:textOutline>
-        </w:rPr>
-        <w:t>_information</w:t>
-      </w:r>
-      <w:proofErr w:type="spellEnd"/>
-      <w:r>
-        <w:rPr>
-          <w:rFonts w:cstheme="minorHAnsi"/>
-          <w:bCs/>
-          <w14:textOutline w14:w="9525" w14:cap="rnd" w14:cmpd="sng" w14:algn="ctr">
-            <w14:noFill/>
-            <w14:prstDash w14:val="solid"/>
-            <w14:bevel/>
-          </w14:textOutline>
-        </w:rPr>
-        <w:t>["URL"</w:t>
-      </w:r>
-      <w:proofErr w:type="gramStart"/>
-      <w:r>
-        <w:rPr>
-          <w:rFonts w:cstheme="minorHAnsi"/>
-          <w:bCs/>
-          <w14:textOutline w14:w="9525" w14:cap="rnd" w14:cmpd="sng" w14:algn="ctr">
-            <w14:noFill/>
-            <w14:prstDash w14:val="solid"/>
-            <w14:bevel/>
-          </w14:textOutline>
-        </w:rPr>
-        <w:t>] }}.</w:t>
-      </w:r>
-      <w:r>
-        <w:rPr>
-          <w:rFonts w:cstheme="minorHAnsi"/>
-          <w:bCs/>
-          <w14:textOutline w14:w="9525" w14:cap="rnd" w14:cmpd="sng" w14:algn="ctr">
-            <w14:noFill/>
-            <w14:prstDash w14:val="solid"/>
-            <w14:bevel/>
-          </w14:textOutline>
-        </w:rPr>
-        <w:t>{</w:t>
-      </w:r>
-      <w:proofErr w:type="gramEnd"/>
-      <w:r>
-        <w:rPr>
-          <w:rFonts w:cstheme="minorHAnsi"/>
-          <w:bCs/>
-          <w14:textOutline w14:w="9525" w14:cap="rnd" w14:cmpd="sng" w14:algn="ctr">
-            <w14:noFill/>
-            <w14:prstDash w14:val="solid"/>
-            <w14:bevel/>
-          </w14:textOutline>
-        </w:rPr>
-        <w:t xml:space="preserve">% if </w:t>
-      </w:r>
-      <w:proofErr w:type="spellStart"/>
-      <w:r>
-        <w:rPr>
-          <w:rFonts w:cstheme="minorHAnsi"/>
-          <w:bCs/>
-          <w14:textOutline w14:w="9525" w14:cap="rnd" w14:cmpd="sng" w14:algn="ctr">
-            <w14:noFill/>
-            <w14:prstDash w14:val="solid"/>
-            <w14:bevel/>
-          </w14:textOutline>
-        </w:rPr>
-        <w:t>direct_inspection_email</w:t>
-      </w:r>
-      <w:proofErr w:type="spellEnd"/>
-      <w:r>
-        <w:rPr>
-          <w:rFonts w:cstheme="minorHAnsi"/>
-          <w:bCs/>
-          <w14:textOutline w14:w="9525" w14:cap="rnd" w14:cmpd="sng" w14:algn="ctr">
-            <w14:noFill/>
-            <w14:prstDash w14:val="solid"/>
-            <w14:bevel/>
-          </w14:textOutline>
-        </w:rPr>
-        <w:t xml:space="preserve"> == False %}</w:t>
+        <w:t>{% if direct_inspection_email == False %}</w:t>
       </w:r>
     </w:p>
     <w:p>
@@ -597,7 +378,6 @@
         </w:rPr>
         <w:t xml:space="preserve">Call the city inspector at </w:t>
       </w:r>
-      <w:proofErr w:type="gramStart"/>
       <w:r>
         <w:rPr>
           <w:b/>
@@ -607,9 +387,18 @@
             <w14:bevel/>
           </w14:textOutline>
         </w:rPr>
-        <w:t xml:space="preserve">{{ </w:t>
-      </w:r>
-      <w:proofErr w:type="spellStart"/>
+        <w:t>{{ inspector_information["Telephone"] }</w:t>
+      </w:r>
+      <w:r>
+        <w:rPr>
+          <w14:textOutline w14:w="9525" w14:cap="rnd" w14:cmpd="sng" w14:algn="ctr">
+            <w14:noFill/>
+            <w14:prstDash w14:val="solid"/>
+            <w14:bevel/>
+          </w14:textOutline>
+        </w:rPr>
+        <w:t xml:space="preserve">}{% if inspector_information["EXTENSION"] %} </w:t>
+      </w:r>
       <w:r>
         <w:rPr>
           <w:b/>
@@ -619,9 +408,8 @@
             <w14:bevel/>
           </w14:textOutline>
         </w:rPr>
-        <w:t>inspector</w:t>
-      </w:r>
-      <w:proofErr w:type="gramEnd"/>
+        <w:t>extension {{ inspector_information["EXTENSION"] }}</w:t>
+      </w:r>
       <w:r>
         <w:rPr>
           <w:b/>
@@ -631,10 +419,254 @@
             <w14:bevel/>
           </w14:textOutline>
         </w:rPr>
-        <w:t>_information</w:t>
-      </w:r>
-      <w:proofErr w:type="spellEnd"/>
-      <w:r>
+        <w:t>{% endif %}</w:t>
+      </w:r>
+      <w:r>
+        <w:rPr>
+          <w14:textOutline w14:w="9525" w14:cap="rnd" w14:cmpd="sng" w14:algn="ctr">
+            <w14:noFill/>
+            <w14:prstDash w14:val="solid"/>
+            <w14:bevel/>
+          </w14:textOutline>
+        </w:rPr>
+        <w:t>.</w:t>
+      </w:r>
+    </w:p>
+    <w:p>
+      <w:pPr>
+        <w:pStyle w:val="ListParagraph"/>
+        <w:numPr>
+          <w:ilvl w:val="0"/>
+          <w:numId w:val="17"/>
+        </w:numPr>
+        <w:spacing w:after="80" w:line="240" w:lineRule="auto"/>
+      </w:pPr>
+      <w:r>
+        <w:t>{%p if inspector_information["Email"] %}</w:t>
+      </w:r>
+    </w:p>
+    <w:p>
+      <w:pPr>
+        <w:pStyle w:val="ListParagraph"/>
+        <w:numPr>
+          <w:ilvl w:val="0"/>
+          <w:numId w:val="17"/>
+        </w:numPr>
+        <w:spacing w:after="80" w:line="240" w:lineRule="auto"/>
+      </w:pPr>
+      <w:r>
+        <w:t xml:space="preserve">{{ </w:t>
+      </w:r>
+      <w:r>
+        <w:t>users[0].normalized_address().city</w:t>
+      </w:r>
+      <w:r>
+        <w:t xml:space="preserve"> }} lists an email address for the inspector. You can also try emailing {{ inspector_information["Email"] }}. If you do not get an answer, try calling instead.</w:t>
+      </w:r>
+    </w:p>
+    <w:p>
+      <w:pPr>
+        <w:pStyle w:val="ListParagraph"/>
+        <w:numPr>
+          <w:ilvl w:val="0"/>
+          <w:numId w:val="17"/>
+        </w:numPr>
+        <w:spacing w:after="80" w:line="240" w:lineRule="auto"/>
+      </w:pPr>
+      <w:r>
+        <w:t>{%p endif %}</w:t>
+      </w:r>
+    </w:p>
+    <w:p>
+      <w:pPr>
+        <w:pStyle w:val="ListParagraph"/>
+        <w:numPr>
+          <w:ilvl w:val="0"/>
+          <w:numId w:val="17"/>
+        </w:numPr>
+        <w:spacing w:after="80" w:line="240" w:lineRule="auto"/>
+      </w:pPr>
+      <w:r>
+        <w:t>{%p if inspector_information["Special Contact"] %}</w:t>
+      </w:r>
+    </w:p>
+    <w:p>
+      <w:pPr>
+        <w:pStyle w:val="ListParagraph"/>
+        <w:numPr>
+          <w:ilvl w:val="0"/>
+          <w:numId w:val="17"/>
+        </w:numPr>
+        <w:spacing w:after="80" w:line="240" w:lineRule="auto"/>
+      </w:pPr>
+      <w:r>
+        <w:t xml:space="preserve">{{ </w:t>
+      </w:r>
+      <w:r>
+        <w:t xml:space="preserve">users[0].normalized_address().city </w:t>
+      </w:r>
+      <w:r>
+        <w:t>}} also lists this special website to report a housing problem: {{ inspector_information["Special Contact"] }}</w:t>
+      </w:r>
+    </w:p>
+    <w:p>
+      <w:pPr>
+        <w:pStyle w:val="ListParagraph"/>
+        <w:numPr>
+          <w:ilvl w:val="0"/>
+          <w:numId w:val="17"/>
+        </w:numPr>
+        <w:spacing w:after="80" w:line="240" w:lineRule="auto"/>
+      </w:pPr>
+      <w:r>
+        <w:t>{%p endif %}</w:t>
+      </w:r>
+    </w:p>
+    <w:p>
+      <w:pPr>
+        <w:pStyle w:val="UpToCodeHeading"/>
+        <w:jc w:val="center"/>
+        <w:rPr>
+          <w:sz w:val="24"/>
+          <w:szCs w:val="24"/>
+        </w:rPr>
+      </w:pPr>
+      <w:r>
+        <w:rPr>
+          <w:sz w:val="24"/>
+          <w:szCs w:val="24"/>
+        </w:rPr>
+        <w:t xml:space="preserve">Option 2: </w:t>
+      </w:r>
+      <w:r>
+        <w:rPr>
+          <w:sz w:val="24"/>
+          <w:szCs w:val="24"/>
+        </w:rPr>
+        <w:t>D</w:t>
+      </w:r>
+      <w:r>
+        <w:rPr>
+          <w:sz w:val="24"/>
+          <w:szCs w:val="24"/>
+        </w:rPr>
+        <w:t xml:space="preserve">eliver </w:t>
+      </w:r>
+      <w:r>
+        <w:rPr>
+          <w:sz w:val="24"/>
+          <w:szCs w:val="24"/>
+        </w:rPr>
+        <w:t>your letter</w:t>
+      </w:r>
+      <w:r>
+        <w:rPr>
+          <w:sz w:val="24"/>
+          <w:szCs w:val="24"/>
+        </w:rPr>
+        <w:t xml:space="preserve"> by mail or in-person</w:t>
+      </w:r>
+    </w:p>
+    <w:p>
+      <w:pPr>
+        <w:pStyle w:val="ListParagraph"/>
+        <w:numPr>
+          <w:ilvl w:val="0"/>
+          <w:numId w:val="5"/>
+        </w:numPr>
+        <w:spacing w:after="80" w:line="240" w:lineRule="auto"/>
+        <w:rPr>
+          <w14:textOutline w14:w="9525" w14:cap="rnd" w14:cmpd="sng" w14:algn="ctr">
+            <w14:noFill/>
+            <w14:prstDash w14:val="solid"/>
+            <w14:bevel/>
+          </w14:textOutline>
+        </w:rPr>
+      </w:pPr>
+      <w:r>
+        <w:rPr>
+          <w14:textOutline w14:w="9525" w14:cap="rnd" w14:cmpd="sng" w14:algn="ctr">
+            <w14:noFill/>
+            <w14:prstDash w14:val="solid"/>
+            <w14:bevel/>
+          </w14:textOutline>
+        </w:rPr>
+        <w:t>If you want, you can also m</w:t>
+      </w:r>
+      <w:r>
+        <w:rPr>
+          <w14:textOutline w14:w="9525" w14:cap="rnd" w14:cmpd="sng" w14:algn="ctr">
+            <w14:noFill/>
+            <w14:prstDash w14:val="solid"/>
+            <w14:bevel/>
+          </w14:textOutline>
+        </w:rPr>
+        <w:t xml:space="preserve">ail your </w:t>
+      </w:r>
+      <w:r>
+        <w:rPr>
+          <w14:textOutline w14:w="9525" w14:cap="rnd" w14:cmpd="sng" w14:algn="ctr">
+            <w14:noFill/>
+            <w14:prstDash w14:val="solid"/>
+            <w14:bevel/>
+          </w14:textOutline>
+        </w:rPr>
+        <w:t>l</w:t>
+      </w:r>
+      <w:r>
+        <w:rPr>
+          <w:rFonts w:cstheme="minorHAnsi"/>
+          <w14:textOutline w14:w="9525" w14:cap="rnd" w14:cmpd="sng" w14:algn="ctr">
+            <w14:noFill/>
+            <w14:prstDash w14:val="solid"/>
+            <w14:bevel/>
+          </w14:textOutline>
+        </w:rPr>
+        <w:t>etter</w:t>
+      </w:r>
+      <w:r>
+        <w:rPr>
+          <w14:textOutline w14:w="9525" w14:cap="rnd" w14:cmpd="sng" w14:algn="ctr">
+            <w14:noFill/>
+            <w14:prstDash w14:val="solid"/>
+            <w14:bevel/>
+          </w14:textOutline>
+        </w:rPr>
+        <w:t xml:space="preserve"> or hand deliver it.</w:t>
+      </w:r>
+    </w:p>
+    <w:p>
+      <w:pPr>
+        <w:pStyle w:val="ListParagraph"/>
+        <w:numPr>
+          <w:ilvl w:val="0"/>
+          <w:numId w:val="5"/>
+        </w:numPr>
+        <w:spacing w:after="80" w:line="240" w:lineRule="auto"/>
+        <w:rPr>
+          <w14:textOutline w14:w="9525" w14:cap="rnd" w14:cmpd="sng" w14:algn="ctr">
+            <w14:noFill/>
+            <w14:prstDash w14:val="solid"/>
+            <w14:bevel/>
+          </w14:textOutline>
+        </w:rPr>
+      </w:pPr>
+      <w:r>
+        <w:rPr>
+          <w14:textOutline w14:w="9525" w14:cap="rnd" w14:cmpd="sng" w14:algn="ctr">
+            <w14:noFill/>
+            <w14:prstDash w14:val="solid"/>
+            <w14:bevel/>
+          </w14:textOutline>
+        </w:rPr>
+        <w:t>Send it to:</w:t>
+      </w:r>
+    </w:p>
+    <w:p>
+      <w:pPr>
+        <w:spacing w:after="80" w:line="240" w:lineRule="auto"/>
+        <w:ind w:left="810"/>
+        <w:contextualSpacing/>
         <w:rPr>
           <w:b/>
           <w14:textOutline w14:w="9525" w14:cap="rnd" w14:cmpd="sng" w14:algn="ctr">
@@ -643,806 +675,50 @@
             <w14:bevel/>
           </w14:textOutline>
         </w:rPr>
-        <w:t>["Telephone"</w:t>
-      </w:r>
-      <w:proofErr w:type="gramStart"/>
+      </w:pPr>
       <w:r>
         <w:rPr>
           <w:b/>
-          <w14:textOutline w14:w="9525" w14:cap="rnd" w14:cmpd="sng" w14:algn="ctr">
-            <w14:noFill/>
-            <w14:prstDash w14:val="solid"/>
-            <w14:bevel/>
-          </w14:textOutline>
-        </w:rPr>
-        <w:t>] }</w:t>
-      </w:r>
-      <w:r>
-        <w:rPr>
-          <w14:textOutline w14:w="9525" w14:cap="rnd" w14:cmpd="sng" w14:algn="ctr">
-            <w14:noFill/>
-            <w14:prstDash w14:val="solid"/>
-            <w14:bevel/>
-          </w14:textOutline>
-        </w:rPr>
-        <w:t>}{</w:t>
-      </w:r>
-      <w:proofErr w:type="gramEnd"/>
-      <w:r>
-        <w:rPr>
-          <w14:textOutline w14:w="9525" w14:cap="rnd" w14:cmpd="sng" w14:algn="ctr">
-            <w14:noFill/>
-            <w14:prstDash w14:val="solid"/>
-            <w14:bevel/>
-          </w14:textOutline>
-        </w:rPr>
-        <w:t xml:space="preserve">% if </w:t>
-      </w:r>
-      <w:proofErr w:type="spellStart"/>
-      <w:r>
-        <w:rPr>
-          <w14:textOutline w14:w="9525" w14:cap="rnd" w14:cmpd="sng" w14:algn="ctr">
-            <w14:noFill/>
-            <w14:prstDash w14:val="solid"/>
-            <w14:bevel/>
-          </w14:textOutline>
-        </w:rPr>
-        <w:t>inspector_information</w:t>
-      </w:r>
-      <w:proofErr w:type="spellEnd"/>
-      <w:r>
-        <w:rPr>
-          <w14:textOutline w14:w="9525" w14:cap="rnd" w14:cmpd="sng" w14:algn="ctr">
-            <w14:noFill/>
-            <w14:prstDash w14:val="solid"/>
-            <w14:bevel/>
-          </w14:textOutline>
-        </w:rPr>
-        <w:t xml:space="preserve">["EXTENSION"] %} </w:t>
+        </w:rPr>
+        <w:t xml:space="preserve">{{ </w:t>
       </w:r>
       <w:r>
         <w:rPr>
           <w:b/>
-          <w14:textOutline w14:w="9525" w14:cap="rnd" w14:cmpd="sng" w14:algn="ctr">
-            <w14:noFill/>
-            <w14:prstDash w14:val="solid"/>
-            <w14:bevel/>
-          </w14:textOutline>
-        </w:rPr>
-        <w:t xml:space="preserve">extension </w:t>
-      </w:r>
-      <w:proofErr w:type="gramStart"/>
+        </w:rPr>
+        <w:t xml:space="preserve">users[0].normalized_address().city </w:t>
+      </w:r>
       <w:r>
         <w:rPr>
           <w:b/>
-          <w14:textOutline w14:w="9525" w14:cap="rnd" w14:cmpd="sng" w14:algn="ctr">
-            <w14:noFill/>
-            <w14:prstDash w14:val="solid"/>
-            <w14:bevel/>
-          </w14:textOutline>
-        </w:rPr>
-        <w:t xml:space="preserve">{{ </w:t>
-      </w:r>
-      <w:proofErr w:type="spellStart"/>
+        </w:rPr>
+        <w:t>}} {{ inspector_information["Title"] }}</w:t>
+      </w:r>
       <w:r>
         <w:rPr>
           <w:b/>
-          <w14:textOutline w14:w="9525" w14:cap="rnd" w14:cmpd="sng" w14:algn="ctr">
-            <w14:noFill/>
-            <w14:prstDash w14:val="solid"/>
-            <w14:bevel/>
-          </w14:textOutline>
-        </w:rPr>
-        <w:t>inspector</w:t>
-      </w:r>
-      <w:proofErr w:type="gramEnd"/>
+        </w:rPr>
+        <w:br/>
+        <w:t>{{ inspector_information["Address Line 1"] }}</w:t>
+      </w:r>
       <w:r>
         <w:rPr>
           <w:b/>
-          <w14:textOutline w14:w="9525" w14:cap="rnd" w14:cmpd="sng" w14:algn="ctr">
-            <w14:noFill/>
-            <w14:prstDash w14:val="solid"/>
-            <w14:bevel/>
-          </w14:textOutline>
-        </w:rPr>
-        <w:t>_information</w:t>
-      </w:r>
-      <w:proofErr w:type="spellEnd"/>
+        </w:rPr>
+        <w:br/>
+        <w:t xml:space="preserve">{{ inspector_information["Address Line 2"] </w:t>
+      </w:r>
       <w:r>
         <w:rPr>
           <w:b/>
-          <w14:textOutline w14:w="9525" w14:cap="rnd" w14:cmpd="sng" w14:algn="ctr">
-            <w14:noFill/>
-            <w14:prstDash w14:val="solid"/>
-            <w14:bevel/>
-          </w14:textOutline>
-        </w:rPr>
-        <w:t>["EXTENSION"</w:t>
-      </w:r>
-      <w:proofErr w:type="gramStart"/>
+        </w:rPr>
+        <w:t>}}, MA {{ inspector_information["Zip"] }}.</w:t>
+      </w:r>
       <w:r>
         <w:rPr>
           <w:b/>
-          <w14:textOutline w14:w="9525" w14:cap="rnd" w14:cmpd="sng" w14:algn="ctr">
-            <w14:noFill/>
-            <w14:prstDash w14:val="solid"/>
-            <w14:bevel/>
-          </w14:textOutline>
-        </w:rPr>
-        <w:t>] }}</w:t>
-      </w:r>
-      <w:r>
-        <w:rPr>
-          <w:b/>
-          <w14:textOutline w14:w="9525" w14:cap="rnd" w14:cmpd="sng" w14:algn="ctr">
-            <w14:noFill/>
-            <w14:prstDash w14:val="solid"/>
-            <w14:bevel/>
-          </w14:textOutline>
-        </w:rPr>
-        <w:t>{</w:t>
-      </w:r>
-      <w:proofErr w:type="gramEnd"/>
-      <w:r>
-        <w:rPr>
-          <w:b/>
-          <w14:textOutline w14:w="9525" w14:cap="rnd" w14:cmpd="sng" w14:algn="ctr">
-            <w14:noFill/>
-            <w14:prstDash w14:val="solid"/>
-            <w14:bevel/>
-          </w14:textOutline>
-        </w:rPr>
-        <w:t>% endif %}</w:t>
-      </w:r>
-      <w:r>
-        <w:rPr>
-          <w14:textOutline w14:w="9525" w14:cap="rnd" w14:cmpd="sng" w14:algn="ctr">
-            <w14:noFill/>
-            <w14:prstDash w14:val="solid"/>
-            <w14:bevel/>
-          </w14:textOutline>
-        </w:rPr>
-        <w:t>.</w:t>
-      </w:r>
-    </w:p>
-    <w:p>
-      <w:pPr>
-        <w:pStyle w:val="ListParagraph"/>
-        <w:numPr>
-          <w:ilvl w:val="0"/>
-          <w:numId w:val="17"/>
-        </w:numPr>
-        <w:spacing w:after="80" w:line="240" w:lineRule="auto"/>
-      </w:pPr>
-      <w:r>
-        <w:t xml:space="preserve">{%p if </w:t>
-      </w:r>
-      <w:proofErr w:type="spellStart"/>
-      <w:r>
-        <w:t>inspector_information</w:t>
-      </w:r>
-      <w:proofErr w:type="spellEnd"/>
-      <w:r>
-        <w:t>["Email"] %}</w:t>
-      </w:r>
-    </w:p>
-    <w:p>
-      <w:pPr>
-        <w:pStyle w:val="ListParagraph"/>
-        <w:numPr>
-          <w:ilvl w:val="0"/>
-          <w:numId w:val="17"/>
-        </w:numPr>
-        <w:spacing w:after="80" w:line="240" w:lineRule="auto"/>
-      </w:pPr>
-      <w:proofErr w:type="gramStart"/>
-      <w:r>
-        <w:t xml:space="preserve">{{ </w:t>
-      </w:r>
-      <w:r>
-        <w:t>users</w:t>
-      </w:r>
-      <w:proofErr w:type="gramEnd"/>
-      <w:r>
-        <w:t>[0</w:t>
-      </w:r>
-      <w:proofErr w:type="gramStart"/>
-      <w:r>
-        <w:t>].</w:t>
-      </w:r>
-      <w:proofErr w:type="spellStart"/>
-      <w:r>
-        <w:t>normalized</w:t>
-      </w:r>
-      <w:proofErr w:type="gramEnd"/>
-      <w:r>
-        <w:t>_</w:t>
-      </w:r>
-      <w:proofErr w:type="gramStart"/>
-      <w:r>
-        <w:t>address</w:t>
-      </w:r>
-      <w:proofErr w:type="spellEnd"/>
-      <w:r>
-        <w:t>().city</w:t>
-      </w:r>
-      <w:proofErr w:type="gramEnd"/>
-      <w:r>
-        <w:t xml:space="preserve"> }} lists an email address for the inspector. You can also try emailing </w:t>
-      </w:r>
-      <w:proofErr w:type="gramStart"/>
-      <w:r>
-        <w:t xml:space="preserve">{{ </w:t>
-      </w:r>
-      <w:proofErr w:type="spellStart"/>
-      <w:r>
-        <w:t>inspector</w:t>
-      </w:r>
-      <w:proofErr w:type="gramEnd"/>
-      <w:r>
-        <w:t>_information</w:t>
-      </w:r>
-      <w:proofErr w:type="spellEnd"/>
-      <w:r>
-        <w:t>["Email"</w:t>
-      </w:r>
-      <w:proofErr w:type="gramStart"/>
-      <w:r>
-        <w:t>] }</w:t>
-      </w:r>
-      <w:proofErr w:type="gramEnd"/>
-      <w:r>
-        <w:t>}. If you do not get an answer, try calling instead.</w:t>
-      </w:r>
-    </w:p>
-    <w:p>
-      <w:pPr>
-        <w:pStyle w:val="ListParagraph"/>
-        <w:numPr>
-          <w:ilvl w:val="0"/>
-          <w:numId w:val="17"/>
-        </w:numPr>
-        <w:spacing w:after="80" w:line="240" w:lineRule="auto"/>
-      </w:pPr>
-      <w:r>
-        <w:t>{%p endif %}</w:t>
-      </w:r>
-    </w:p>
-    <w:p>
-      <w:pPr>
-        <w:pStyle w:val="ListParagraph"/>
-        <w:numPr>
-          <w:ilvl w:val="0"/>
-          <w:numId w:val="17"/>
-        </w:numPr>
-        <w:spacing w:after="80" w:line="240" w:lineRule="auto"/>
-      </w:pPr>
-      <w:r>
-        <w:t xml:space="preserve">{%p if </w:t>
-      </w:r>
-      <w:proofErr w:type="spellStart"/>
-      <w:r>
-        <w:t>inspector_</w:t>
-      </w:r>
-      <w:proofErr w:type="gramStart"/>
-      <w:r>
-        <w:t>information</w:t>
-      </w:r>
-      <w:proofErr w:type="spellEnd"/>
-      <w:r>
-        <w:t>[</w:t>
-      </w:r>
-      <w:proofErr w:type="gramEnd"/>
-      <w:r>
-        <w:t>"Special Contact"] %}</w:t>
-      </w:r>
-    </w:p>
-    <w:p>
-      <w:pPr>
-        <w:pStyle w:val="ListParagraph"/>
-        <w:numPr>
-          <w:ilvl w:val="0"/>
-          <w:numId w:val="17"/>
-        </w:numPr>
-        <w:spacing w:after="80" w:line="240" w:lineRule="auto"/>
-      </w:pPr>
-      <w:proofErr w:type="gramStart"/>
-      <w:r>
-        <w:t xml:space="preserve">{{ </w:t>
-      </w:r>
-      <w:r>
-        <w:t>users</w:t>
-      </w:r>
-      <w:proofErr w:type="gramEnd"/>
-      <w:r>
-        <w:t>[0</w:t>
-      </w:r>
-      <w:proofErr w:type="gramStart"/>
-      <w:r>
-        <w:t>].</w:t>
-      </w:r>
-      <w:proofErr w:type="spellStart"/>
-      <w:r>
-        <w:t>normalized</w:t>
-      </w:r>
-      <w:proofErr w:type="gramEnd"/>
-      <w:r>
-        <w:t>_</w:t>
-      </w:r>
-      <w:proofErr w:type="gramStart"/>
-      <w:r>
-        <w:t>address</w:t>
-      </w:r>
-      <w:proofErr w:type="spellEnd"/>
-      <w:r>
-        <w:t>().city</w:t>
-      </w:r>
-      <w:proofErr w:type="gramEnd"/>
-      <w:r>
-        <w:t xml:space="preserve"> </w:t>
-      </w:r>
-      <w:r>
-        <w:t xml:space="preserve">}} also lists this special website to report a housing problem: </w:t>
-      </w:r>
-      <w:proofErr w:type="gramStart"/>
-      <w:r>
-        <w:t xml:space="preserve">{{ </w:t>
-      </w:r>
-      <w:proofErr w:type="spellStart"/>
-      <w:r>
-        <w:t>inspector</w:t>
-      </w:r>
-      <w:proofErr w:type="gramEnd"/>
-      <w:r>
-        <w:t>_</w:t>
-      </w:r>
-      <w:proofErr w:type="gramStart"/>
-      <w:r>
-        <w:t>information</w:t>
-      </w:r>
-      <w:proofErr w:type="spellEnd"/>
-      <w:r>
-        <w:t>[</w:t>
-      </w:r>
-      <w:proofErr w:type="gramEnd"/>
-      <w:r>
-        <w:t>"Special Contact"</w:t>
-      </w:r>
-      <w:proofErr w:type="gramStart"/>
-      <w:r>
-        <w:t>] }</w:t>
-      </w:r>
-      <w:proofErr w:type="gramEnd"/>
-      <w:r>
-        <w:t>}</w:t>
-      </w:r>
-    </w:p>
-    <w:p>
-      <w:pPr>
-        <w:pStyle w:val="ListParagraph"/>
-        <w:numPr>
-          <w:ilvl w:val="0"/>
-          <w:numId w:val="17"/>
-        </w:numPr>
-        <w:spacing w:after="80" w:line="240" w:lineRule="auto"/>
-      </w:pPr>
-      <w:r>
-        <w:t>{%p endif %}</w:t>
-      </w:r>
-    </w:p>
-    <w:p>
-      <w:pPr>
-        <w:pStyle w:val="UpToCodeHeading"/>
-        <w:jc w:val="center"/>
-        <w:rPr>
-          <w:sz w:val="24"/>
-          <w:szCs w:val="24"/>
-        </w:rPr>
-      </w:pPr>
-      <w:r>
-        <w:rPr>
-          <w:sz w:val="24"/>
-          <w:szCs w:val="24"/>
-        </w:rPr>
-        <w:t xml:space="preserve">Option 2: </w:t>
-      </w:r>
-      <w:r>
-        <w:rPr>
-          <w:sz w:val="24"/>
-          <w:szCs w:val="24"/>
-        </w:rPr>
-        <w:t>D</w:t>
-      </w:r>
-      <w:r>
-        <w:rPr>
-          <w:sz w:val="24"/>
-          <w:szCs w:val="24"/>
-        </w:rPr>
-        <w:t xml:space="preserve">eliver </w:t>
-      </w:r>
-      <w:r>
-        <w:rPr>
-          <w:sz w:val="24"/>
-          <w:szCs w:val="24"/>
-        </w:rPr>
-        <w:t>your letter</w:t>
-      </w:r>
-      <w:r>
-        <w:rPr>
-          <w:sz w:val="24"/>
-          <w:szCs w:val="24"/>
-        </w:rPr>
-        <w:t xml:space="preserve"> by mail or in-person</w:t>
-      </w:r>
-    </w:p>
-    <w:p>
-      <w:pPr>
-        <w:pStyle w:val="ListParagraph"/>
-        <w:numPr>
-          <w:ilvl w:val="0"/>
-          <w:numId w:val="5"/>
-        </w:numPr>
-        <w:spacing w:after="80" w:line="240" w:lineRule="auto"/>
-        <w:rPr>
-          <w14:textOutline w14:w="9525" w14:cap="rnd" w14:cmpd="sng" w14:algn="ctr">
-            <w14:noFill/>
-            <w14:prstDash w14:val="solid"/>
-            <w14:bevel/>
-          </w14:textOutline>
-        </w:rPr>
-      </w:pPr>
-      <w:r>
-        <w:rPr>
-          <w14:textOutline w14:w="9525" w14:cap="rnd" w14:cmpd="sng" w14:algn="ctr">
-            <w14:noFill/>
-            <w14:prstDash w14:val="solid"/>
-            <w14:bevel/>
-          </w14:textOutline>
-        </w:rPr>
-        <w:t>If you want, you can also m</w:t>
-      </w:r>
-      <w:r>
-        <w:rPr>
-          <w14:textOutline w14:w="9525" w14:cap="rnd" w14:cmpd="sng" w14:algn="ctr">
-            <w14:noFill/>
-            <w14:prstDash w14:val="solid"/>
-            <w14:bevel/>
-          </w14:textOutline>
-        </w:rPr>
-        <w:t xml:space="preserve">ail your </w:t>
-      </w:r>
-      <w:r>
-        <w:rPr>
-          <w14:textOutline w14:w="9525" w14:cap="rnd" w14:cmpd="sng" w14:algn="ctr">
-            <w14:noFill/>
-            <w14:prstDash w14:val="solid"/>
-            <w14:bevel/>
-          </w14:textOutline>
-        </w:rPr>
-        <w:t>l</w:t>
-      </w:r>
-      <w:r>
-        <w:rPr>
-          <w:rFonts w:cstheme="minorHAnsi"/>
-          <w14:textOutline w14:w="9525" w14:cap="rnd" w14:cmpd="sng" w14:algn="ctr">
-            <w14:noFill/>
-            <w14:prstDash w14:val="solid"/>
-            <w14:bevel/>
-          </w14:textOutline>
-        </w:rPr>
-        <w:t>etter</w:t>
-      </w:r>
-      <w:r>
-        <w:rPr>
-          <w14:textOutline w14:w="9525" w14:cap="rnd" w14:cmpd="sng" w14:algn="ctr">
-            <w14:noFill/>
-            <w14:prstDash w14:val="solid"/>
-            <w14:bevel/>
-          </w14:textOutline>
-        </w:rPr>
-        <w:t xml:space="preserve"> or hand deliver it.</w:t>
-      </w:r>
-    </w:p>
-    <w:p>
-      <w:pPr>
-        <w:pStyle w:val="ListParagraph"/>
-        <w:numPr>
-          <w:ilvl w:val="0"/>
-          <w:numId w:val="5"/>
-        </w:numPr>
-        <w:spacing w:after="80" w:line="240" w:lineRule="auto"/>
-        <w:rPr>
-          <w14:textOutline w14:w="9525" w14:cap="rnd" w14:cmpd="sng" w14:algn="ctr">
-            <w14:noFill/>
-            <w14:prstDash w14:val="solid"/>
-            <w14:bevel/>
-          </w14:textOutline>
-        </w:rPr>
-      </w:pPr>
-      <w:r>
-        <w:rPr>
-          <w14:textOutline w14:w="9525" w14:cap="rnd" w14:cmpd="sng" w14:algn="ctr">
-            <w14:noFill/>
-            <w14:prstDash w14:val="solid"/>
-            <w14:bevel/>
-          </w14:textOutline>
-        </w:rPr>
-        <w:t>Send it to:</w:t>
-      </w:r>
-    </w:p>
-    <w:p>
-      <w:pPr>
-        <w:spacing w:after="80" w:line="240" w:lineRule="auto"/>
-        <w:ind w:left="810"/>
-        <w:contextualSpacing/>
-        <w:rPr>
-          <w:b/>
-          <w14:textOutline w14:w="9525" w14:cap="rnd" w14:cmpd="sng" w14:algn="ctr">
-            <w14:noFill/>
-            <w14:prstDash w14:val="solid"/>
-            <w14:bevel/>
-          </w14:textOutline>
-        </w:rPr>
-      </w:pPr>
-      <w:proofErr w:type="gramStart"/>
-      <w:r>
-        <w:rPr>
-          <w:b/>
-        </w:rPr>
-        <w:t xml:space="preserve">{{ </w:t>
-      </w:r>
-      <w:r>
-        <w:rPr>
-          <w:b/>
-        </w:rPr>
-        <w:t>users</w:t>
-      </w:r>
-      <w:proofErr w:type="gramEnd"/>
-      <w:r>
-        <w:rPr>
-          <w:b/>
-        </w:rPr>
-        <w:t>[0</w:t>
-      </w:r>
-      <w:proofErr w:type="gramStart"/>
-      <w:r>
-        <w:rPr>
-          <w:b/>
-        </w:rPr>
-        <w:t>].</w:t>
-      </w:r>
-      <w:proofErr w:type="spellStart"/>
-      <w:r>
-        <w:rPr>
-          <w:b/>
-        </w:rPr>
-        <w:t>normalized</w:t>
-      </w:r>
-      <w:proofErr w:type="gramEnd"/>
-      <w:r>
-        <w:rPr>
-          <w:b/>
-        </w:rPr>
-        <w:t>_</w:t>
-      </w:r>
-      <w:proofErr w:type="gramStart"/>
-      <w:r>
-        <w:rPr>
-          <w:b/>
-        </w:rPr>
-        <w:t>address</w:t>
-      </w:r>
-      <w:proofErr w:type="spellEnd"/>
-      <w:r>
-        <w:rPr>
-          <w:b/>
-        </w:rPr>
-        <w:t>().city</w:t>
-      </w:r>
-      <w:proofErr w:type="gramEnd"/>
-      <w:r>
-        <w:rPr>
-          <w:b/>
-        </w:rPr>
-        <w:t xml:space="preserve"> </w:t>
-      </w:r>
-      <w:r>
-        <w:rPr>
-          <w:b/>
-        </w:rPr>
-        <w:t xml:space="preserve">}} </w:t>
-      </w:r>
-      <w:proofErr w:type="gramStart"/>
-      <w:r>
-        <w:rPr>
-          <w:b/>
-        </w:rPr>
-        <w:t xml:space="preserve">{{ </w:t>
-      </w:r>
-      <w:proofErr w:type="spellStart"/>
-      <w:r>
-        <w:rPr>
-          <w:b/>
-        </w:rPr>
-        <w:t>inspector</w:t>
-      </w:r>
-      <w:proofErr w:type="gramEnd"/>
-      <w:r>
-        <w:rPr>
-          <w:b/>
-        </w:rPr>
-        <w:t>_information</w:t>
-      </w:r>
-      <w:proofErr w:type="spellEnd"/>
-      <w:r>
-        <w:rPr>
-          <w:b/>
-        </w:rPr>
-        <w:t>["Title"] }}</w:t>
-      </w:r>
-      <w:r>
-        <w:rPr>
-          <w:b/>
-        </w:rPr>
-        <w:br/>
-      </w:r>
-      <w:proofErr w:type="gramStart"/>
-      <w:r>
-        <w:rPr>
-          <w:b/>
-        </w:rPr>
-        <w:t xml:space="preserve">{{ </w:t>
-      </w:r>
-      <w:proofErr w:type="spellStart"/>
-      <w:r>
-        <w:rPr>
-          <w:b/>
-        </w:rPr>
-        <w:t>inspector</w:t>
-      </w:r>
-      <w:proofErr w:type="gramEnd"/>
-      <w:r>
-        <w:rPr>
-          <w:b/>
-        </w:rPr>
-        <w:t>_</w:t>
-      </w:r>
-      <w:proofErr w:type="gramStart"/>
-      <w:r>
-        <w:rPr>
-          <w:b/>
-        </w:rPr>
-        <w:t>information</w:t>
-      </w:r>
-      <w:proofErr w:type="spellEnd"/>
-      <w:r>
-        <w:rPr>
-          <w:b/>
-        </w:rPr>
-        <w:t>[</w:t>
-      </w:r>
-      <w:proofErr w:type="gramEnd"/>
-      <w:r>
-        <w:rPr>
-          <w:b/>
-        </w:rPr>
-        <w:t>"Address Line 1"] }}</w:t>
-      </w:r>
-      <w:r>
-        <w:rPr>
-          <w:b/>
-        </w:rPr>
-        <w:br/>
-      </w:r>
-      <w:proofErr w:type="gramStart"/>
-      <w:r>
-        <w:rPr>
-          <w:b/>
-        </w:rPr>
-        <w:t xml:space="preserve">{{ </w:t>
-      </w:r>
-      <w:proofErr w:type="spellStart"/>
-      <w:r>
-        <w:rPr>
-          <w:b/>
-        </w:rPr>
-        <w:t>inspector</w:t>
-      </w:r>
-      <w:proofErr w:type="gramEnd"/>
-      <w:r>
-        <w:rPr>
-          <w:b/>
-        </w:rPr>
-        <w:t>_</w:t>
-      </w:r>
-      <w:proofErr w:type="gramStart"/>
-      <w:r>
-        <w:rPr>
-          <w:b/>
-        </w:rPr>
-        <w:t>information</w:t>
-      </w:r>
-      <w:proofErr w:type="spellEnd"/>
-      <w:r>
-        <w:rPr>
-          <w:b/>
-        </w:rPr>
-        <w:t>[</w:t>
-      </w:r>
-      <w:proofErr w:type="gramEnd"/>
-      <w:r>
-        <w:rPr>
-          <w:b/>
-        </w:rPr>
-        <w:t>"Address Line 2"</w:t>
-      </w:r>
-      <w:proofErr w:type="gramStart"/>
-      <w:r>
-        <w:rPr>
-          <w:b/>
-        </w:rPr>
-        <w:t xml:space="preserve">] </w:t>
-      </w:r>
-      <w:r>
-        <w:rPr>
-          <w:b/>
-        </w:rPr>
-        <w:t>}</w:t>
-      </w:r>
-      <w:proofErr w:type="gramEnd"/>
-      <w:r>
-        <w:rPr>
-          <w:b/>
-        </w:rPr>
-        <w:t xml:space="preserve">}, MA </w:t>
-      </w:r>
-      <w:proofErr w:type="gramStart"/>
-      <w:r>
-        <w:rPr>
-          <w:b/>
-        </w:rPr>
-        <w:t xml:space="preserve">{{ </w:t>
-      </w:r>
-      <w:proofErr w:type="spellStart"/>
-      <w:r>
-        <w:rPr>
-          <w:b/>
-        </w:rPr>
-        <w:t>inspector</w:t>
-      </w:r>
-      <w:proofErr w:type="gramEnd"/>
-      <w:r>
-        <w:rPr>
-          <w:b/>
-        </w:rPr>
-        <w:t>_information</w:t>
-      </w:r>
-      <w:proofErr w:type="spellEnd"/>
-      <w:r>
-        <w:rPr>
-          <w:b/>
-        </w:rPr>
-        <w:t>["Zip"</w:t>
-      </w:r>
-      <w:proofErr w:type="gramStart"/>
-      <w:r>
-        <w:rPr>
-          <w:b/>
-        </w:rPr>
-        <w:t>] }}.</w:t>
-      </w:r>
-      <w:r>
-        <w:rPr>
-          <w:b/>
-        </w:rPr>
-        <w:t>{</w:t>
-      </w:r>
-      <w:proofErr w:type="gramEnd"/>
-      <w:r>
-        <w:rPr>
-          <w:b/>
-        </w:rPr>
-        <w:t>% endif %}</w:t>
+        </w:rPr>
+        <w:t>{% endif %}</w:t>
       </w:r>
     </w:p>
     <w:p>
@@ -1588,15 +864,7 @@
         <w:spacing w:after="80" w:line="240" w:lineRule="auto"/>
       </w:pPr>
       <w:r>
-        <w:t xml:space="preserve">Use the letter and your checklist to make sure the inspector checks on </w:t>
-      </w:r>
-      <w:proofErr w:type="gramStart"/>
-      <w:r>
-        <w:t>all of</w:t>
-      </w:r>
-      <w:proofErr w:type="gramEnd"/>
-      <w:r>
-        <w:t xml:space="preserve"> the problems that you noticed. They may not check every item unless you ask them to.</w:t>
+        <w:t>Use the letter and your checklist to make sure the inspector checks on all of the problems that you noticed. They may not check every item unless you ask them to.</w:t>
       </w:r>
     </w:p>
     <w:p>
@@ -1737,17 +1005,8 @@
           <w:sz w:val="24"/>
           <w:szCs w:val="24"/>
         </w:rPr>
-        <w:t xml:space="preserve">list </w:t>
-      </w:r>
-      <w:proofErr w:type="gramStart"/>
-      <w:r>
-        <w:rPr>
-          <w:sz w:val="24"/>
-          <w:szCs w:val="24"/>
-        </w:rPr>
-        <w:t>all of</w:t>
-      </w:r>
-      <w:proofErr w:type="gramEnd"/>
+        <w:t>list all of</w:t>
+      </w:r>
       <w:r>
         <w:rPr>
           <w:sz w:val="24"/>
@@ -1817,56 +1076,15 @@
           <w:sz w:val="24"/>
           <w:szCs w:val="24"/>
         </w:rPr>
-        <w:t xml:space="preserve">{% if </w:t>
-      </w:r>
-      <w:proofErr w:type="spellStart"/>
+        <w:t>{% if ll_name_unknown %}your landlord{% else %}{{ other_parties }}{% endif %}</w:t>
+      </w:r>
       <w:r>
         <w:rPr>
           <w:sz w:val="24"/>
           <w:szCs w:val="24"/>
         </w:rPr>
-        <w:t>ll_name_unknown</w:t>
-      </w:r>
-      <w:proofErr w:type="spellEnd"/>
-      <w:r>
-        <w:rPr>
-          <w:sz w:val="24"/>
-          <w:szCs w:val="24"/>
-        </w:rPr>
-        <w:t xml:space="preserve"> %}your landlord{% else %}{{ </w:t>
-      </w:r>
-      <w:proofErr w:type="spellStart"/>
-      <w:r>
-        <w:rPr>
-          <w:sz w:val="24"/>
-          <w:szCs w:val="24"/>
-        </w:rPr>
-        <w:t>other_parties</w:t>
-      </w:r>
-      <w:proofErr w:type="spellEnd"/>
-      <w:r>
-        <w:rPr>
-          <w:sz w:val="24"/>
-          <w:szCs w:val="24"/>
-        </w:rPr>
-        <w:t xml:space="preserve"> }}{% endif %}</w:t>
-      </w:r>
-      <w:r>
-        <w:rPr>
-          <w:sz w:val="24"/>
-          <w:szCs w:val="24"/>
-        </w:rPr>
-        <w:t xml:space="preserve">{% if </w:t>
-      </w:r>
-      <w:proofErr w:type="spellStart"/>
-      <w:r>
-        <w:rPr>
-          <w:sz w:val="24"/>
-          <w:szCs w:val="24"/>
-        </w:rPr>
-        <w:t>other_parties</w:t>
-      </w:r>
-      <w:proofErr w:type="spellEnd"/>
+        <w:t>{% if other_parties</w:t>
+      </w:r>
       <w:r>
         <w:rPr>
           <w:sz w:val="24"/>
@@ -1945,7 +1163,7 @@
 </file>
 
 <file path=word/endnotes.xml><?xml version="1.0" encoding="utf-8"?>
-<w:endnotes xmlns:wpc="http://schemas.microsoft.com/office/word/2010/wordprocessingCanvas" xmlns:cx="http://schemas.microsoft.com/office/drawing/2014/chartex" xmlns:cx1="http://schemas.microsoft.com/office/drawing/2015/9/8/chartex" xmlns:cx2="http://schemas.microsoft.com/office/drawing/2015/10/21/chartex" xmlns:cx3="http://schemas.microsoft.com/office/drawing/2016/5/9/chartex" xmlns:cx4="http://schemas.microsoft.com/office/drawing/2016/5/10/chartex" xmlns:cx5="http://schemas.microsoft.com/office/drawing/2016/5/11/chartex" xmlns:cx6="http://schemas.microsoft.com/office/drawing/2016/5/12/chartex" xmlns:cx7="http://schemas.microsoft.com/office/drawing/2016/5/13/chartex" xmlns:cx8="http://schemas.microsoft.com/office/drawing/2016/5/14/chartex" xmlns:mc="http://schemas.openxmlformats.org/markup-compatibility/2006" xmlns:aink="http://schemas.microsoft.com/office/drawing/2016/ink" xmlns:am3d="http://schemas.microsoft.com/office/drawing/2017/model3d" xmlns:o="urn:schemas-microsoft-com:office:office" xmlns:oel="http://schemas.microsoft.com/office/2019/extlst" xmlns:r="http://schemas.openxmlformats.org/officeDocument/2006/relationships" xmlns:m="http://schemas.openxmlformats.org/officeDocument/2006/math" xmlns:v="urn:schemas-microsoft-com:vml" xmlns:wp14="http://schemas.microsoft.com/office/word/2010/wordprocessingDrawing" xmlns:wp="http://schemas.openxmlformats.org/drawingml/2006/wordprocessingDrawing" xmlns:w10="urn:schemas-microsoft-com:office:word" xmlns:w="http://schemas.openxmlformats.org/wordprocessingml/2006/main" xmlns:w14="http://schemas.microsoft.com/office/word/2010/wordml" xmlns:w15="http://schemas.microsoft.com/office/word/2012/wordml" xmlns:w16cex="http://schemas.microsoft.com/office/word/2018/wordml/cex" xmlns:w16cid="http://schemas.microsoft.com/office/word/2016/wordml/cid" xmlns:w16="http://schemas.microsoft.com/office/word/2018/wordml" xmlns:w16du="http://schemas.microsoft.com/office/word/2023/wordml/word16du" xmlns:w16sdtdh="http://schemas.microsoft.com/office/word/2020/wordml/sdtdatahash" xmlns:w16sdtfl="http://schemas.microsoft.com/office/word/2024/wordml/sdtformatlock" xmlns:w16se="http://schemas.microsoft.com/office/word/2015/wordml/symex" xmlns:wpg="http://schemas.microsoft.com/office/word/2010/wordprocessingGroup" xmlns:wpi="http://schemas.microsoft.com/office/word/2010/wordprocessingInk" xmlns:wne="http://schemas.microsoft.com/office/word/2006/wordml" xmlns:wps="http://schemas.microsoft.com/office/word/2010/wordprocessingShape" mc:Ignorable="w14 w15 w16se w16cid w16 w16cex w16sdtdh w16sdtfl w16du wp14">
+<w:endnotes xmlns:wpc="http://schemas.microsoft.com/office/word/2010/wordprocessingCanvas" xmlns:cx="http://schemas.microsoft.com/office/drawing/2014/chartex" xmlns:cx1="http://schemas.microsoft.com/office/drawing/2015/9/8/chartex" xmlns:cx2="http://schemas.microsoft.com/office/drawing/2015/10/21/chartex" xmlns:cx3="http://schemas.microsoft.com/office/drawing/2016/5/9/chartex" xmlns:cx4="http://schemas.microsoft.com/office/drawing/2016/5/10/chartex" xmlns:cx5="http://schemas.microsoft.com/office/drawing/2016/5/11/chartex" xmlns:cx6="http://schemas.microsoft.com/office/drawing/2016/5/12/chartex" xmlns:cx7="http://schemas.microsoft.com/office/drawing/2016/5/13/chartex" xmlns:cx8="http://schemas.microsoft.com/office/drawing/2016/5/14/chartex" xmlns:mc="http://schemas.openxmlformats.org/markup-compatibility/2006" xmlns:aink="http://schemas.microsoft.com/office/drawing/2016/ink" xmlns:am3d="http://schemas.microsoft.com/office/drawing/2017/model3d" xmlns:o="urn:schemas-microsoft-com:office:office" xmlns:oel="http://schemas.microsoft.com/office/2019/extlst" xmlns:r="http://schemas.openxmlformats.org/officeDocument/2006/relationships" xmlns:m="http://schemas.openxmlformats.org/officeDocument/2006/math" xmlns:v="urn:schemas-microsoft-com:vml" xmlns:wp14="http://schemas.microsoft.com/office/word/2010/wordprocessingDrawing" xmlns:wp="http://schemas.openxmlformats.org/drawingml/2006/wordprocessingDrawing" xmlns:w10="urn:schemas-microsoft-com:office:word" xmlns:w="http://schemas.openxmlformats.org/wordprocessingml/2006/main" xmlns:w14="http://schemas.microsoft.com/office/word/2010/wordml" xmlns:w15="http://schemas.microsoft.com/office/word/2012/wordml" xmlns:w16cex="http://schemas.microsoft.com/office/word/2018/wordml/cex" xmlns:w16cid="http://schemas.microsoft.com/office/word/2016/wordml/cid" xmlns:w16="http://schemas.microsoft.com/office/word/2018/wordml" xmlns:w16du="http://schemas.microsoft.com/office/word/2023/wordml/word16du" xmlns:w16sdtdh="http://schemas.microsoft.com/office/word/2020/wordml/sdtdatahash" xmlns:w16se="http://schemas.microsoft.com/office/word/2015/wordml/symex" xmlns:wpg="http://schemas.microsoft.com/office/word/2010/wordprocessingGroup" xmlns:wpi="http://schemas.microsoft.com/office/word/2010/wordprocessingInk" xmlns:wne="http://schemas.microsoft.com/office/word/2006/wordml" xmlns:wps="http://schemas.microsoft.com/office/word/2010/wordprocessingShape" mc:Ignorable="w14 w15 w16se w16cid w16 w16cex w16sdtdh w16du wp14">
   <w:endnote w:type="separator" w:id="-1">
     <w:p>
       <w:pPr>
@@ -1970,7 +1188,7 @@
 </file>
 
 <file path=word/footer1.xml><?xml version="1.0" encoding="utf-8"?>
-<w:ftr xmlns:wpc="http://schemas.microsoft.com/office/word/2010/wordprocessingCanvas" xmlns:cx="http://schemas.microsoft.com/office/drawing/2014/chartex" xmlns:cx1="http://schemas.microsoft.com/office/drawing/2015/9/8/chartex" xmlns:cx2="http://schemas.microsoft.com/office/drawing/2015/10/21/chartex" xmlns:cx3="http://schemas.microsoft.com/office/drawing/2016/5/9/chartex" xmlns:cx4="http://schemas.microsoft.com/office/drawing/2016/5/10/chartex" xmlns:cx5="http://schemas.microsoft.com/office/drawing/2016/5/11/chartex" xmlns:cx6="http://schemas.microsoft.com/office/drawing/2016/5/12/chartex" xmlns:cx7="http://schemas.microsoft.com/office/drawing/2016/5/13/chartex" xmlns:cx8="http://schemas.microsoft.com/office/drawing/2016/5/14/chartex" xmlns:mc="http://schemas.openxmlformats.org/markup-compatibility/2006" xmlns:aink="http://schemas.microsoft.com/office/drawing/2016/ink" xmlns:am3d="http://schemas.microsoft.com/office/drawing/2017/model3d" xmlns:o="urn:schemas-microsoft-com:office:office" xmlns:oel="http://schemas.microsoft.com/office/2019/extlst" xmlns:r="http://schemas.openxmlformats.org/officeDocument/2006/relationships" xmlns:m="http://schemas.openxmlformats.org/officeDocument/2006/math" xmlns:v="urn:schemas-microsoft-com:vml" xmlns:wp14="http://schemas.microsoft.com/office/word/2010/wordprocessingDrawing" xmlns:wp="http://schemas.openxmlformats.org/drawingml/2006/wordprocessingDrawing" xmlns:w10="urn:schemas-microsoft-com:office:word" xmlns:w="http://schemas.openxmlformats.org/wordprocessingml/2006/main" xmlns:w14="http://schemas.microsoft.com/office/word/2010/wordml" xmlns:w15="http://schemas.microsoft.com/office/word/2012/wordml" xmlns:w16cex="http://schemas.microsoft.com/office/word/2018/wordml/cex" xmlns:w16cid="http://schemas.microsoft.com/office/word/2016/wordml/cid" xmlns:w16="http://schemas.microsoft.com/office/word/2018/wordml" xmlns:w16du="http://schemas.microsoft.com/office/word/2023/wordml/word16du" xmlns:w16sdtdh="http://schemas.microsoft.com/office/word/2020/wordml/sdtdatahash" xmlns:w16sdtfl="http://schemas.microsoft.com/office/word/2024/wordml/sdtformatlock" xmlns:w16se="http://schemas.microsoft.com/office/word/2015/wordml/symex" xmlns:wpg="http://schemas.microsoft.com/office/word/2010/wordprocessingGroup" xmlns:wpi="http://schemas.microsoft.com/office/word/2010/wordprocessingInk" xmlns:wne="http://schemas.microsoft.com/office/word/2006/wordml" xmlns:wps="http://schemas.microsoft.com/office/word/2010/wordprocessingShape" mc:Ignorable="w14 w15 w16se w16cid w16 w16cex w16sdtdh w16sdtfl w16du wp14">
+<w:ftr xmlns:wpc="http://schemas.microsoft.com/office/word/2010/wordprocessingCanvas" xmlns:cx="http://schemas.microsoft.com/office/drawing/2014/chartex" xmlns:cx1="http://schemas.microsoft.com/office/drawing/2015/9/8/chartex" xmlns:cx2="http://schemas.microsoft.com/office/drawing/2015/10/21/chartex" xmlns:cx3="http://schemas.microsoft.com/office/drawing/2016/5/9/chartex" xmlns:cx4="http://schemas.microsoft.com/office/drawing/2016/5/10/chartex" xmlns:cx5="http://schemas.microsoft.com/office/drawing/2016/5/11/chartex" xmlns:cx6="http://schemas.microsoft.com/office/drawing/2016/5/12/chartex" xmlns:cx7="http://schemas.microsoft.com/office/drawing/2016/5/13/chartex" xmlns:cx8="http://schemas.microsoft.com/office/drawing/2016/5/14/chartex" xmlns:mc="http://schemas.openxmlformats.org/markup-compatibility/2006" xmlns:aink="http://schemas.microsoft.com/office/drawing/2016/ink" xmlns:am3d="http://schemas.microsoft.com/office/drawing/2017/model3d" xmlns:o="urn:schemas-microsoft-com:office:office" xmlns:oel="http://schemas.microsoft.com/office/2019/extlst" xmlns:r="http://schemas.openxmlformats.org/officeDocument/2006/relationships" xmlns:m="http://schemas.openxmlformats.org/officeDocument/2006/math" xmlns:v="urn:schemas-microsoft-com:vml" xmlns:wp14="http://schemas.microsoft.com/office/word/2010/wordprocessingDrawing" xmlns:wp="http://schemas.openxmlformats.org/drawingml/2006/wordprocessingDrawing" xmlns:w10="urn:schemas-microsoft-com:office:word" xmlns:w="http://schemas.openxmlformats.org/wordprocessingml/2006/main" xmlns:w14="http://schemas.microsoft.com/office/word/2010/wordml" xmlns:w15="http://schemas.microsoft.com/office/word/2012/wordml" xmlns:w16cex="http://schemas.microsoft.com/office/word/2018/wordml/cex" xmlns:w16cid="http://schemas.microsoft.com/office/word/2016/wordml/cid" xmlns:w16="http://schemas.microsoft.com/office/word/2018/wordml" xmlns:w16du="http://schemas.microsoft.com/office/word/2023/wordml/word16du" xmlns:w16sdtdh="http://schemas.microsoft.com/office/word/2020/wordml/sdtdatahash" xmlns:w16se="http://schemas.microsoft.com/office/word/2015/wordml/symex" xmlns:wpg="http://schemas.microsoft.com/office/word/2010/wordprocessingGroup" xmlns:wpi="http://schemas.microsoft.com/office/word/2010/wordprocessingInk" xmlns:wne="http://schemas.microsoft.com/office/word/2006/wordml" xmlns:wps="http://schemas.microsoft.com/office/word/2010/wordprocessingShape" mc:Ignorable="w14 w15 w16se w16cid w16 w16cex w16sdtdh w16du wp14">
   <w:p>
     <w:pPr>
       <w:pStyle w:val="Footer"/>
@@ -1980,7 +1198,7 @@
 </file>
 
 <file path=word/footer2.xml><?xml version="1.0" encoding="utf-8"?>
-<w:ftr xmlns:wpc="http://schemas.microsoft.com/office/word/2010/wordprocessingCanvas" xmlns:cx="http://schemas.microsoft.com/office/drawing/2014/chartex" xmlns:cx1="http://schemas.microsoft.com/office/drawing/2015/9/8/chartex" xmlns:cx2="http://schemas.microsoft.com/office/drawing/2015/10/21/chartex" xmlns:cx3="http://schemas.microsoft.com/office/drawing/2016/5/9/chartex" xmlns:cx4="http://schemas.microsoft.com/office/drawing/2016/5/10/chartex" xmlns:cx5="http://schemas.microsoft.com/office/drawing/2016/5/11/chartex" xmlns:cx6="http://schemas.microsoft.com/office/drawing/2016/5/12/chartex" xmlns:cx7="http://schemas.microsoft.com/office/drawing/2016/5/13/chartex" xmlns:cx8="http://schemas.microsoft.com/office/drawing/2016/5/14/chartex" xmlns:mc="http://schemas.openxmlformats.org/markup-compatibility/2006" xmlns:aink="http://schemas.microsoft.com/office/drawing/2016/ink" xmlns:am3d="http://schemas.microsoft.com/office/drawing/2017/model3d" xmlns:o="urn:schemas-microsoft-com:office:office" xmlns:oel="http://schemas.microsoft.com/office/2019/extlst" xmlns:r="http://schemas.openxmlformats.org/officeDocument/2006/relationships" xmlns:m="http://schemas.openxmlformats.org/officeDocument/2006/math" xmlns:v="urn:schemas-microsoft-com:vml" xmlns:wp14="http://schemas.microsoft.com/office/word/2010/wordprocessingDrawing" xmlns:wp="http://schemas.openxmlformats.org/drawingml/2006/wordprocessingDrawing" xmlns:w10="urn:schemas-microsoft-com:office:word" xmlns:w="http://schemas.openxmlformats.org/wordprocessingml/2006/main" xmlns:w14="http://schemas.microsoft.com/office/word/2010/wordml" xmlns:w15="http://schemas.microsoft.com/office/word/2012/wordml" xmlns:w16cex="http://schemas.microsoft.com/office/word/2018/wordml/cex" xmlns:w16cid="http://schemas.microsoft.com/office/word/2016/wordml/cid" xmlns:w16="http://schemas.microsoft.com/office/word/2018/wordml" xmlns:w16du="http://schemas.microsoft.com/office/word/2023/wordml/word16du" xmlns:w16sdtdh="http://schemas.microsoft.com/office/word/2020/wordml/sdtdatahash" xmlns:w16sdtfl="http://schemas.microsoft.com/office/word/2024/wordml/sdtformatlock" xmlns:w16se="http://schemas.microsoft.com/office/word/2015/wordml/symex" xmlns:wpg="http://schemas.microsoft.com/office/word/2010/wordprocessingGroup" xmlns:wpi="http://schemas.microsoft.com/office/word/2010/wordprocessingInk" xmlns:wne="http://schemas.microsoft.com/office/word/2006/wordml" xmlns:wps="http://schemas.microsoft.com/office/word/2010/wordprocessingShape" mc:Ignorable="w14 w15 w16se w16cid w16 w16cex w16sdtdh w16sdtfl w16du wp14">
+<w:ftr xmlns:wpc="http://schemas.microsoft.com/office/word/2010/wordprocessingCanvas" xmlns:cx="http://schemas.microsoft.com/office/drawing/2014/chartex" xmlns:cx1="http://schemas.microsoft.com/office/drawing/2015/9/8/chartex" xmlns:cx2="http://schemas.microsoft.com/office/drawing/2015/10/21/chartex" xmlns:cx3="http://schemas.microsoft.com/office/drawing/2016/5/9/chartex" xmlns:cx4="http://schemas.microsoft.com/office/drawing/2016/5/10/chartex" xmlns:cx5="http://schemas.microsoft.com/office/drawing/2016/5/11/chartex" xmlns:cx6="http://schemas.microsoft.com/office/drawing/2016/5/12/chartex" xmlns:cx7="http://schemas.microsoft.com/office/drawing/2016/5/13/chartex" xmlns:cx8="http://schemas.microsoft.com/office/drawing/2016/5/14/chartex" xmlns:mc="http://schemas.openxmlformats.org/markup-compatibility/2006" xmlns:aink="http://schemas.microsoft.com/office/drawing/2016/ink" xmlns:am3d="http://schemas.microsoft.com/office/drawing/2017/model3d" xmlns:o="urn:schemas-microsoft-com:office:office" xmlns:oel="http://schemas.microsoft.com/office/2019/extlst" xmlns:r="http://schemas.openxmlformats.org/officeDocument/2006/relationships" xmlns:m="http://schemas.openxmlformats.org/officeDocument/2006/math" xmlns:v="urn:schemas-microsoft-com:vml" xmlns:wp14="http://schemas.microsoft.com/office/word/2010/wordprocessingDrawing" xmlns:wp="http://schemas.openxmlformats.org/drawingml/2006/wordprocessingDrawing" xmlns:w10="urn:schemas-microsoft-com:office:word" xmlns:w="http://schemas.openxmlformats.org/wordprocessingml/2006/main" xmlns:w14="http://schemas.microsoft.com/office/word/2010/wordml" xmlns:w15="http://schemas.microsoft.com/office/word/2012/wordml" xmlns:w16cex="http://schemas.microsoft.com/office/word/2018/wordml/cex" xmlns:w16cid="http://schemas.microsoft.com/office/word/2016/wordml/cid" xmlns:w16="http://schemas.microsoft.com/office/word/2018/wordml" xmlns:w16du="http://schemas.microsoft.com/office/word/2023/wordml/word16du" xmlns:w16sdtdh="http://schemas.microsoft.com/office/word/2020/wordml/sdtdatahash" xmlns:w16se="http://schemas.microsoft.com/office/word/2015/wordml/symex" xmlns:wpg="http://schemas.microsoft.com/office/word/2010/wordprocessingGroup" xmlns:wpi="http://schemas.microsoft.com/office/word/2010/wordprocessingInk" xmlns:wne="http://schemas.microsoft.com/office/word/2006/wordml" xmlns:wps="http://schemas.microsoft.com/office/word/2010/wordprocessingShape" mc:Ignorable="w14 w15 w16se w16cid w16 w16cex w16sdtdh w16du wp14">
   <w:p>
     <w:pPr>
       <w:pStyle w:val="Footer"/>
@@ -2043,7 +1261,7 @@
 </file>
 
 <file path=word/footer3.xml><?xml version="1.0" encoding="utf-8"?>
-<w:ftr xmlns:wpc="http://schemas.microsoft.com/office/word/2010/wordprocessingCanvas" xmlns:cx="http://schemas.microsoft.com/office/drawing/2014/chartex" xmlns:cx1="http://schemas.microsoft.com/office/drawing/2015/9/8/chartex" xmlns:cx2="http://schemas.microsoft.com/office/drawing/2015/10/21/chartex" xmlns:cx3="http://schemas.microsoft.com/office/drawing/2016/5/9/chartex" xmlns:cx4="http://schemas.microsoft.com/office/drawing/2016/5/10/chartex" xmlns:cx5="http://schemas.microsoft.com/office/drawing/2016/5/11/chartex" xmlns:cx6="http://schemas.microsoft.com/office/drawing/2016/5/12/chartex" xmlns:cx7="http://schemas.microsoft.com/office/drawing/2016/5/13/chartex" xmlns:cx8="http://schemas.microsoft.com/office/drawing/2016/5/14/chartex" xmlns:mc="http://schemas.openxmlformats.org/markup-compatibility/2006" xmlns:aink="http://schemas.microsoft.com/office/drawing/2016/ink" xmlns:am3d="http://schemas.microsoft.com/office/drawing/2017/model3d" xmlns:o="urn:schemas-microsoft-com:office:office" xmlns:oel="http://schemas.microsoft.com/office/2019/extlst" xmlns:r="http://schemas.openxmlformats.org/officeDocument/2006/relationships" xmlns:m="http://schemas.openxmlformats.org/officeDocument/2006/math" xmlns:v="urn:schemas-microsoft-com:vml" xmlns:wp14="http://schemas.microsoft.com/office/word/2010/wordprocessingDrawing" xmlns:wp="http://schemas.openxmlformats.org/drawingml/2006/wordprocessingDrawing" xmlns:w10="urn:schemas-microsoft-com:office:word" xmlns:w="http://schemas.openxmlformats.org/wordprocessingml/2006/main" xmlns:w14="http://schemas.microsoft.com/office/word/2010/wordml" xmlns:w15="http://schemas.microsoft.com/office/word/2012/wordml" xmlns:w16cex="http://schemas.microsoft.com/office/word/2018/wordml/cex" xmlns:w16cid="http://schemas.microsoft.com/office/word/2016/wordml/cid" xmlns:w16="http://schemas.microsoft.com/office/word/2018/wordml" xmlns:w16du="http://schemas.microsoft.com/office/word/2023/wordml/word16du" xmlns:w16sdtdh="http://schemas.microsoft.com/office/word/2020/wordml/sdtdatahash" xmlns:w16sdtfl="http://schemas.microsoft.com/office/word/2024/wordml/sdtformatlock" xmlns:w16se="http://schemas.microsoft.com/office/word/2015/wordml/symex" xmlns:wpg="http://schemas.microsoft.com/office/word/2010/wordprocessingGroup" xmlns:wpi="http://schemas.microsoft.com/office/word/2010/wordprocessingInk" xmlns:wne="http://schemas.microsoft.com/office/word/2006/wordml" xmlns:wps="http://schemas.microsoft.com/office/word/2010/wordprocessingShape" mc:Ignorable="w14 w15 w16se w16cid w16 w16cex w16sdtdh w16sdtfl w16du wp14">
+<w:ftr xmlns:wpc="http://schemas.microsoft.com/office/word/2010/wordprocessingCanvas" xmlns:cx="http://schemas.microsoft.com/office/drawing/2014/chartex" xmlns:cx1="http://schemas.microsoft.com/office/drawing/2015/9/8/chartex" xmlns:cx2="http://schemas.microsoft.com/office/drawing/2015/10/21/chartex" xmlns:cx3="http://schemas.microsoft.com/office/drawing/2016/5/9/chartex" xmlns:cx4="http://schemas.microsoft.com/office/drawing/2016/5/10/chartex" xmlns:cx5="http://schemas.microsoft.com/office/drawing/2016/5/11/chartex" xmlns:cx6="http://schemas.microsoft.com/office/drawing/2016/5/12/chartex" xmlns:cx7="http://schemas.microsoft.com/office/drawing/2016/5/13/chartex" xmlns:cx8="http://schemas.microsoft.com/office/drawing/2016/5/14/chartex" xmlns:mc="http://schemas.openxmlformats.org/markup-compatibility/2006" xmlns:aink="http://schemas.microsoft.com/office/drawing/2016/ink" xmlns:am3d="http://schemas.microsoft.com/office/drawing/2017/model3d" xmlns:o="urn:schemas-microsoft-com:office:office" xmlns:oel="http://schemas.microsoft.com/office/2019/extlst" xmlns:r="http://schemas.openxmlformats.org/officeDocument/2006/relationships" xmlns:m="http://schemas.openxmlformats.org/officeDocument/2006/math" xmlns:v="urn:schemas-microsoft-com:vml" xmlns:wp14="http://schemas.microsoft.com/office/word/2010/wordprocessingDrawing" xmlns:wp="http://schemas.openxmlformats.org/drawingml/2006/wordprocessingDrawing" xmlns:w10="urn:schemas-microsoft-com:office:word" xmlns:w="http://schemas.openxmlformats.org/wordprocessingml/2006/main" xmlns:w14="http://schemas.microsoft.com/office/word/2010/wordml" xmlns:w15="http://schemas.microsoft.com/office/word/2012/wordml" xmlns:w16cex="http://schemas.microsoft.com/office/word/2018/wordml/cex" xmlns:w16cid="http://schemas.microsoft.com/office/word/2016/wordml/cid" xmlns:w16="http://schemas.microsoft.com/office/word/2018/wordml" xmlns:w16du="http://schemas.microsoft.com/office/word/2023/wordml/word16du" xmlns:w16sdtdh="http://schemas.microsoft.com/office/word/2020/wordml/sdtdatahash" xmlns:w16se="http://schemas.microsoft.com/office/word/2015/wordml/symex" xmlns:wpg="http://schemas.microsoft.com/office/word/2010/wordprocessingGroup" xmlns:wpi="http://schemas.microsoft.com/office/word/2010/wordprocessingInk" xmlns:wne="http://schemas.microsoft.com/office/word/2006/wordml" xmlns:wps="http://schemas.microsoft.com/office/word/2010/wordprocessingShape" mc:Ignorable="w14 w15 w16se w16cid w16 w16cex w16sdtdh w16du wp14">
   <w:p>
     <w:pPr>
       <w:pStyle w:val="Footer"/>
@@ -2106,7 +1324,7 @@
 </file>
 
 <file path=word/footer4.xml><?xml version="1.0" encoding="utf-8"?>
-<w:ftr xmlns:wpc="http://schemas.microsoft.com/office/word/2010/wordprocessingCanvas" xmlns:cx="http://schemas.microsoft.com/office/drawing/2014/chartex" xmlns:cx1="http://schemas.microsoft.com/office/drawing/2015/9/8/chartex" xmlns:cx2="http://schemas.microsoft.com/office/drawing/2015/10/21/chartex" xmlns:cx3="http://schemas.microsoft.com/office/drawing/2016/5/9/chartex" xmlns:cx4="http://schemas.microsoft.com/office/drawing/2016/5/10/chartex" xmlns:cx5="http://schemas.microsoft.com/office/drawing/2016/5/11/chartex" xmlns:cx6="http://schemas.microsoft.com/office/drawing/2016/5/12/chartex" xmlns:cx7="http://schemas.microsoft.com/office/drawing/2016/5/13/chartex" xmlns:cx8="http://schemas.microsoft.com/office/drawing/2016/5/14/chartex" xmlns:mc="http://schemas.openxmlformats.org/markup-compatibility/2006" xmlns:aink="http://schemas.microsoft.com/office/drawing/2016/ink" xmlns:am3d="http://schemas.microsoft.com/office/drawing/2017/model3d" xmlns:o="urn:schemas-microsoft-com:office:office" xmlns:oel="http://schemas.microsoft.com/office/2019/extlst" xmlns:r="http://schemas.openxmlformats.org/officeDocument/2006/relationships" xmlns:m="http://schemas.openxmlformats.org/officeDocument/2006/math" xmlns:v="urn:schemas-microsoft-com:vml" xmlns:wp14="http://schemas.microsoft.com/office/word/2010/wordprocessingDrawing" xmlns:wp="http://schemas.openxmlformats.org/drawingml/2006/wordprocessingDrawing" xmlns:w10="urn:schemas-microsoft-com:office:word" xmlns:w="http://schemas.openxmlformats.org/wordprocessingml/2006/main" xmlns:w14="http://schemas.microsoft.com/office/word/2010/wordml" xmlns:w15="http://schemas.microsoft.com/office/word/2012/wordml" xmlns:w16cex="http://schemas.microsoft.com/office/word/2018/wordml/cex" xmlns:w16cid="http://schemas.microsoft.com/office/word/2016/wordml/cid" xmlns:w16="http://schemas.microsoft.com/office/word/2018/wordml" xmlns:w16du="http://schemas.microsoft.com/office/word/2023/wordml/word16du" xmlns:w16sdtdh="http://schemas.microsoft.com/office/word/2020/wordml/sdtdatahash" xmlns:w16sdtfl="http://schemas.microsoft.com/office/word/2024/wordml/sdtformatlock" xmlns:w16se="http://schemas.microsoft.com/office/word/2015/wordml/symex" xmlns:wpg="http://schemas.microsoft.com/office/word/2010/wordprocessingGroup" xmlns:wpi="http://schemas.microsoft.com/office/word/2010/wordprocessingInk" xmlns:wne="http://schemas.microsoft.com/office/word/2006/wordml" xmlns:wps="http://schemas.microsoft.com/office/word/2010/wordprocessingShape" mc:Ignorable="w14 w15 w16se w16cid w16 w16cex w16sdtdh w16sdtfl w16du wp14">
+<w:ftr xmlns:wpc="http://schemas.microsoft.com/office/word/2010/wordprocessingCanvas" xmlns:cx="http://schemas.microsoft.com/office/drawing/2014/chartex" xmlns:cx1="http://schemas.microsoft.com/office/drawing/2015/9/8/chartex" xmlns:cx2="http://schemas.microsoft.com/office/drawing/2015/10/21/chartex" xmlns:cx3="http://schemas.microsoft.com/office/drawing/2016/5/9/chartex" xmlns:cx4="http://schemas.microsoft.com/office/drawing/2016/5/10/chartex" xmlns:cx5="http://schemas.microsoft.com/office/drawing/2016/5/11/chartex" xmlns:cx6="http://schemas.microsoft.com/office/drawing/2016/5/12/chartex" xmlns:cx7="http://schemas.microsoft.com/office/drawing/2016/5/13/chartex" xmlns:cx8="http://schemas.microsoft.com/office/drawing/2016/5/14/chartex" xmlns:mc="http://schemas.openxmlformats.org/markup-compatibility/2006" xmlns:aink="http://schemas.microsoft.com/office/drawing/2016/ink" xmlns:am3d="http://schemas.microsoft.com/office/drawing/2017/model3d" xmlns:o="urn:schemas-microsoft-com:office:office" xmlns:oel="http://schemas.microsoft.com/office/2019/extlst" xmlns:r="http://schemas.openxmlformats.org/officeDocument/2006/relationships" xmlns:m="http://schemas.openxmlformats.org/officeDocument/2006/math" xmlns:v="urn:schemas-microsoft-com:vml" xmlns:wp14="http://schemas.microsoft.com/office/word/2010/wordprocessingDrawing" xmlns:wp="http://schemas.openxmlformats.org/drawingml/2006/wordprocessingDrawing" xmlns:w10="urn:schemas-microsoft-com:office:word" xmlns:w="http://schemas.openxmlformats.org/wordprocessingml/2006/main" xmlns:w14="http://schemas.microsoft.com/office/word/2010/wordml" xmlns:w15="http://schemas.microsoft.com/office/word/2012/wordml" xmlns:w16cex="http://schemas.microsoft.com/office/word/2018/wordml/cex" xmlns:w16cid="http://schemas.microsoft.com/office/word/2016/wordml/cid" xmlns:w16="http://schemas.microsoft.com/office/word/2018/wordml" xmlns:w16du="http://schemas.microsoft.com/office/word/2023/wordml/word16du" xmlns:w16sdtdh="http://schemas.microsoft.com/office/word/2020/wordml/sdtdatahash" xmlns:w16se="http://schemas.microsoft.com/office/word/2015/wordml/symex" xmlns:wpg="http://schemas.microsoft.com/office/word/2010/wordprocessingGroup" xmlns:wpi="http://schemas.microsoft.com/office/word/2010/wordprocessingInk" xmlns:wne="http://schemas.microsoft.com/office/word/2006/wordml" xmlns:wps="http://schemas.microsoft.com/office/word/2010/wordprocessingShape" mc:Ignorable="w14 w15 w16se w16cid w16 w16cex w16sdtdh w16du wp14">
   <w:p>
     <w:pPr>
       <w:pStyle w:val="Footer"/>
@@ -2171,7 +1389,7 @@
 </file>
 
 <file path=word/footnotes.xml><?xml version="1.0" encoding="utf-8"?>
-<w:footnotes xmlns:wpc="http://schemas.microsoft.com/office/word/2010/wordprocessingCanvas" xmlns:cx="http://schemas.microsoft.com/office/drawing/2014/chartex" xmlns:cx1="http://schemas.microsoft.com/office/drawing/2015/9/8/chartex" xmlns:cx2="http://schemas.microsoft.com/office/drawing/2015/10/21/chartex" xmlns:cx3="http://schemas.microsoft.com/office/drawing/2016/5/9/chartex" xmlns:cx4="http://schemas.microsoft.com/office/drawing/2016/5/10/chartex" xmlns:cx5="http://schemas.microsoft.com/office/drawing/2016/5/11/chartex" xmlns:cx6="http://schemas.microsoft.com/office/drawing/2016/5/12/chartex" xmlns:cx7="http://schemas.microsoft.com/office/drawing/2016/5/13/chartex" xmlns:cx8="http://schemas.microsoft.com/office/drawing/2016/5/14/chartex" xmlns:mc="http://schemas.openxmlformats.org/markup-compatibility/2006" xmlns:aink="http://schemas.microsoft.com/office/drawing/2016/ink" xmlns:am3d="http://schemas.microsoft.com/office/drawing/2017/model3d" xmlns:o="urn:schemas-microsoft-com:office:office" xmlns:oel="http://schemas.microsoft.com/office/2019/extlst" xmlns:r="http://schemas.openxmlformats.org/officeDocument/2006/relationships" xmlns:m="http://schemas.openxmlformats.org/officeDocument/2006/math" xmlns:v="urn:schemas-microsoft-com:vml" xmlns:wp14="http://schemas.microsoft.com/office/word/2010/wordprocessingDrawing" xmlns:wp="http://schemas.openxmlformats.org/drawingml/2006/wordprocessingDrawing" xmlns:w10="urn:schemas-microsoft-com:office:word" xmlns:w="http://schemas.openxmlformats.org/wordprocessingml/2006/main" xmlns:w14="http://schemas.microsoft.com/office/word/2010/wordml" xmlns:w15="http://schemas.microsoft.com/office/word/2012/wordml" xmlns:w16cex="http://schemas.microsoft.com/office/word/2018/wordml/cex" xmlns:w16cid="http://schemas.microsoft.com/office/word/2016/wordml/cid" xmlns:w16="http://schemas.microsoft.com/office/word/2018/wordml" xmlns:w16du="http://schemas.microsoft.com/office/word/2023/wordml/word16du" xmlns:w16sdtdh="http://schemas.microsoft.com/office/word/2020/wordml/sdtdatahash" xmlns:w16sdtfl="http://schemas.microsoft.com/office/word/2024/wordml/sdtformatlock" xmlns:w16se="http://schemas.microsoft.com/office/word/2015/wordml/symex" xmlns:wpg="http://schemas.microsoft.com/office/word/2010/wordprocessingGroup" xmlns:wpi="http://schemas.microsoft.com/office/word/2010/wordprocessingInk" xmlns:wne="http://schemas.microsoft.com/office/word/2006/wordml" xmlns:wps="http://schemas.microsoft.com/office/word/2010/wordprocessingShape" mc:Ignorable="w14 w15 w16se w16cid w16 w16cex w16sdtdh w16sdtfl w16du wp14">
+<w:footnotes xmlns:wpc="http://schemas.microsoft.com/office/word/2010/wordprocessingCanvas" xmlns:cx="http://schemas.microsoft.com/office/drawing/2014/chartex" xmlns:cx1="http://schemas.microsoft.com/office/drawing/2015/9/8/chartex" xmlns:cx2="http://schemas.microsoft.com/office/drawing/2015/10/21/chartex" xmlns:cx3="http://schemas.microsoft.com/office/drawing/2016/5/9/chartex" xmlns:cx4="http://schemas.microsoft.com/office/drawing/2016/5/10/chartex" xmlns:cx5="http://schemas.microsoft.com/office/drawing/2016/5/11/chartex" xmlns:cx6="http://schemas.microsoft.com/office/drawing/2016/5/12/chartex" xmlns:cx7="http://schemas.microsoft.com/office/drawing/2016/5/13/chartex" xmlns:cx8="http://schemas.microsoft.com/office/drawing/2016/5/14/chartex" xmlns:mc="http://schemas.openxmlformats.org/markup-compatibility/2006" xmlns:aink="http://schemas.microsoft.com/office/drawing/2016/ink" xmlns:am3d="http://schemas.microsoft.com/office/drawing/2017/model3d" xmlns:o="urn:schemas-microsoft-com:office:office" xmlns:oel="http://schemas.microsoft.com/office/2019/extlst" xmlns:r="http://schemas.openxmlformats.org/officeDocument/2006/relationships" xmlns:m="http://schemas.openxmlformats.org/officeDocument/2006/math" xmlns:v="urn:schemas-microsoft-com:vml" xmlns:wp14="http://schemas.microsoft.com/office/word/2010/wordprocessingDrawing" xmlns:wp="http://schemas.openxmlformats.org/drawingml/2006/wordprocessingDrawing" xmlns:w10="urn:schemas-microsoft-com:office:word" xmlns:w="http://schemas.openxmlformats.org/wordprocessingml/2006/main" xmlns:w14="http://schemas.microsoft.com/office/word/2010/wordml" xmlns:w15="http://schemas.microsoft.com/office/word/2012/wordml" xmlns:w16cex="http://schemas.microsoft.com/office/word/2018/wordml/cex" xmlns:w16cid="http://schemas.microsoft.com/office/word/2016/wordml/cid" xmlns:w16="http://schemas.microsoft.com/office/word/2018/wordml" xmlns:w16du="http://schemas.microsoft.com/office/word/2023/wordml/word16du" xmlns:w16sdtdh="http://schemas.microsoft.com/office/word/2020/wordml/sdtdatahash" xmlns:w16se="http://schemas.microsoft.com/office/word/2015/wordml/symex" xmlns:wpg="http://schemas.microsoft.com/office/word/2010/wordprocessingGroup" xmlns:wpi="http://schemas.microsoft.com/office/word/2010/wordprocessingInk" xmlns:wne="http://schemas.microsoft.com/office/word/2006/wordml" xmlns:wps="http://schemas.microsoft.com/office/word/2010/wordprocessingShape" mc:Ignorable="w14 w15 w16se w16cid w16 w16cex w16sdtdh w16du wp14">
   <w:footnote w:type="separator" w:id="-1">
     <w:p>
       <w:pPr>
@@ -2196,7 +1414,7 @@
 </file>
 
 <file path=word/header1.xml><?xml version="1.0" encoding="utf-8"?>
-<w:hdr xmlns:wpc="http://schemas.microsoft.com/office/word/2010/wordprocessingCanvas" xmlns:cx="http://schemas.microsoft.com/office/drawing/2014/chartex" xmlns:cx1="http://schemas.microsoft.com/office/drawing/2015/9/8/chartex" xmlns:cx2="http://schemas.microsoft.com/office/drawing/2015/10/21/chartex" xmlns:cx3="http://schemas.microsoft.com/office/drawing/2016/5/9/chartex" xmlns:cx4="http://schemas.microsoft.com/office/drawing/2016/5/10/chartex" xmlns:cx5="http://schemas.microsoft.com/office/drawing/2016/5/11/chartex" xmlns:cx6="http://schemas.microsoft.com/office/drawing/2016/5/12/chartex" xmlns:cx7="http://schemas.microsoft.com/office/drawing/2016/5/13/chartex" xmlns:cx8="http://schemas.microsoft.com/office/drawing/2016/5/14/chartex" xmlns:mc="http://schemas.openxmlformats.org/markup-compatibility/2006" xmlns:aink="http://schemas.microsoft.com/office/drawing/2016/ink" xmlns:am3d="http://schemas.microsoft.com/office/drawing/2017/model3d" xmlns:o="urn:schemas-microsoft-com:office:office" xmlns:oel="http://schemas.microsoft.com/office/2019/extlst" xmlns:r="http://schemas.openxmlformats.org/officeDocument/2006/relationships" xmlns:m="http://schemas.openxmlformats.org/officeDocument/2006/math" xmlns:v="urn:schemas-microsoft-com:vml" xmlns:wp14="http://schemas.microsoft.com/office/word/2010/wordprocessingDrawing" xmlns:wp="http://schemas.openxmlformats.org/drawingml/2006/wordprocessingDrawing" xmlns:w10="urn:schemas-microsoft-com:office:word" xmlns:w="http://schemas.openxmlformats.org/wordprocessingml/2006/main" xmlns:w14="http://schemas.microsoft.com/office/word/2010/wordml" xmlns:w15="http://schemas.microsoft.com/office/word/2012/wordml" xmlns:w16cex="http://schemas.microsoft.com/office/word/2018/wordml/cex" xmlns:w16cid="http://schemas.microsoft.com/office/word/2016/wordml/cid" xmlns:w16="http://schemas.microsoft.com/office/word/2018/wordml" xmlns:w16du="http://schemas.microsoft.com/office/word/2023/wordml/word16du" xmlns:w16sdtdh="http://schemas.microsoft.com/office/word/2020/wordml/sdtdatahash" xmlns:w16sdtfl="http://schemas.microsoft.com/office/word/2024/wordml/sdtformatlock" xmlns:w16se="http://schemas.microsoft.com/office/word/2015/wordml/symex" xmlns:wpg="http://schemas.microsoft.com/office/word/2010/wordprocessingGroup" xmlns:wpi="http://schemas.microsoft.com/office/word/2010/wordprocessingInk" xmlns:wne="http://schemas.microsoft.com/office/word/2006/wordml" xmlns:wps="http://schemas.microsoft.com/office/word/2010/wordprocessingShape" mc:Ignorable="w14 w15 w16se w16cid w16 w16cex w16sdtdh w16sdtfl w16du wp14">
+<w:hdr xmlns:wpc="http://schemas.microsoft.com/office/word/2010/wordprocessingCanvas" xmlns:cx="http://schemas.microsoft.com/office/drawing/2014/chartex" xmlns:cx1="http://schemas.microsoft.com/office/drawing/2015/9/8/chartex" xmlns:cx2="http://schemas.microsoft.com/office/drawing/2015/10/21/chartex" xmlns:cx3="http://schemas.microsoft.com/office/drawing/2016/5/9/chartex" xmlns:cx4="http://schemas.microsoft.com/office/drawing/2016/5/10/chartex" xmlns:cx5="http://schemas.microsoft.com/office/drawing/2016/5/11/chartex" xmlns:cx6="http://schemas.microsoft.com/office/drawing/2016/5/12/chartex" xmlns:cx7="http://schemas.microsoft.com/office/drawing/2016/5/13/chartex" xmlns:cx8="http://schemas.microsoft.com/office/drawing/2016/5/14/chartex" xmlns:mc="http://schemas.openxmlformats.org/markup-compatibility/2006" xmlns:aink="http://schemas.microsoft.com/office/drawing/2016/ink" xmlns:am3d="http://schemas.microsoft.com/office/drawing/2017/model3d" xmlns:o="urn:schemas-microsoft-com:office:office" xmlns:oel="http://schemas.microsoft.com/office/2019/extlst" xmlns:r="http://schemas.openxmlformats.org/officeDocument/2006/relationships" xmlns:m="http://schemas.openxmlformats.org/officeDocument/2006/math" xmlns:v="urn:schemas-microsoft-com:vml" xmlns:wp14="http://schemas.microsoft.com/office/word/2010/wordprocessingDrawing" xmlns:wp="http://schemas.openxmlformats.org/drawingml/2006/wordprocessingDrawing" xmlns:w10="urn:schemas-microsoft-com:office:word" xmlns:w="http://schemas.openxmlformats.org/wordprocessingml/2006/main" xmlns:w14="http://schemas.microsoft.com/office/word/2010/wordml" xmlns:w15="http://schemas.microsoft.com/office/word/2012/wordml" xmlns:w16cex="http://schemas.microsoft.com/office/word/2018/wordml/cex" xmlns:w16cid="http://schemas.microsoft.com/office/word/2016/wordml/cid" xmlns:w16="http://schemas.microsoft.com/office/word/2018/wordml" xmlns:w16du="http://schemas.microsoft.com/office/word/2023/wordml/word16du" xmlns:w16sdtdh="http://schemas.microsoft.com/office/word/2020/wordml/sdtdatahash" xmlns:w16se="http://schemas.microsoft.com/office/word/2015/wordml/symex" xmlns:wpg="http://schemas.microsoft.com/office/word/2010/wordprocessingGroup" xmlns:wpi="http://schemas.microsoft.com/office/word/2010/wordprocessingInk" xmlns:wne="http://schemas.microsoft.com/office/word/2006/wordml" xmlns:wps="http://schemas.microsoft.com/office/word/2010/wordprocessingShape" mc:Ignorable="w14 w15 w16se w16cid w16 w16cex w16sdtdh w16du wp14">
   <w:p>
     <w:pPr>
       <w:pStyle w:val="Header"/>
@@ -2206,7 +1424,7 @@
 </file>
 
 <file path=word/header2.xml><?xml version="1.0" encoding="utf-8"?>
-<w:hdr xmlns:wpc="http://schemas.microsoft.com/office/word/2010/wordprocessingCanvas" xmlns:cx="http://schemas.microsoft.com/office/drawing/2014/chartex" xmlns:cx1="http://schemas.microsoft.com/office/drawing/2015/9/8/chartex" xmlns:cx2="http://schemas.microsoft.com/office/drawing/2015/10/21/chartex" xmlns:cx3="http://schemas.microsoft.com/office/drawing/2016/5/9/chartex" xmlns:cx4="http://schemas.microsoft.com/office/drawing/2016/5/10/chartex" xmlns:cx5="http://schemas.microsoft.com/office/drawing/2016/5/11/chartex" xmlns:cx6="http://schemas.microsoft.com/office/drawing/2016/5/12/chartex" xmlns:cx7="http://schemas.microsoft.com/office/drawing/2016/5/13/chartex" xmlns:cx8="http://schemas.microsoft.com/office/drawing/2016/5/14/chartex" xmlns:mc="http://schemas.openxmlformats.org/markup-compatibility/2006" xmlns:aink="http://schemas.microsoft.com/office/drawing/2016/ink" xmlns:am3d="http://schemas.microsoft.com/office/drawing/2017/model3d" xmlns:o="urn:schemas-microsoft-com:office:office" xmlns:oel="http://schemas.microsoft.com/office/2019/extlst" xmlns:r="http://schemas.openxmlformats.org/officeDocument/2006/relationships" xmlns:m="http://schemas.openxmlformats.org/officeDocument/2006/math" xmlns:v="urn:schemas-microsoft-com:vml" xmlns:wp14="http://schemas.microsoft.com/office/word/2010/wordprocessingDrawing" xmlns:wp="http://schemas.openxmlformats.org/drawingml/2006/wordprocessingDrawing" xmlns:w10="urn:schemas-microsoft-com:office:word" xmlns:w="http://schemas.openxmlformats.org/wordprocessingml/2006/main" xmlns:w14="http://schemas.microsoft.com/office/word/2010/wordml" xmlns:w15="http://schemas.microsoft.com/office/word/2012/wordml" xmlns:w16cex="http://schemas.microsoft.com/office/word/2018/wordml/cex" xmlns:w16cid="http://schemas.microsoft.com/office/word/2016/wordml/cid" xmlns:w16="http://schemas.microsoft.com/office/word/2018/wordml" xmlns:w16du="http://schemas.microsoft.com/office/word/2023/wordml/word16du" xmlns:w16sdtdh="http://schemas.microsoft.com/office/word/2020/wordml/sdtdatahash" xmlns:w16sdtfl="http://schemas.microsoft.com/office/word/2024/wordml/sdtformatlock" xmlns:w16se="http://schemas.microsoft.com/office/word/2015/wordml/symex" xmlns:wpg="http://schemas.microsoft.com/office/word/2010/wordprocessingGroup" xmlns:wpi="http://schemas.microsoft.com/office/word/2010/wordprocessingInk" xmlns:wne="http://schemas.microsoft.com/office/word/2006/wordml" xmlns:wps="http://schemas.microsoft.com/office/word/2010/wordprocessingShape" mc:Ignorable="w14 w15 w16se w16cid w16 w16cex w16sdtdh w16sdtfl w16du wp14">
+<w:hdr xmlns:wpc="http://schemas.microsoft.com/office/word/2010/wordprocessingCanvas" xmlns:cx="http://schemas.microsoft.com/office/drawing/2014/chartex" xmlns:cx1="http://schemas.microsoft.com/office/drawing/2015/9/8/chartex" xmlns:cx2="http://schemas.microsoft.com/office/drawing/2015/10/21/chartex" xmlns:cx3="http://schemas.microsoft.com/office/drawing/2016/5/9/chartex" xmlns:cx4="http://schemas.microsoft.com/office/drawing/2016/5/10/chartex" xmlns:cx5="http://schemas.microsoft.com/office/drawing/2016/5/11/chartex" xmlns:cx6="http://schemas.microsoft.com/office/drawing/2016/5/12/chartex" xmlns:cx7="http://schemas.microsoft.com/office/drawing/2016/5/13/chartex" xmlns:cx8="http://schemas.microsoft.com/office/drawing/2016/5/14/chartex" xmlns:mc="http://schemas.openxmlformats.org/markup-compatibility/2006" xmlns:aink="http://schemas.microsoft.com/office/drawing/2016/ink" xmlns:am3d="http://schemas.microsoft.com/office/drawing/2017/model3d" xmlns:o="urn:schemas-microsoft-com:office:office" xmlns:oel="http://schemas.microsoft.com/office/2019/extlst" xmlns:r="http://schemas.openxmlformats.org/officeDocument/2006/relationships" xmlns:m="http://schemas.openxmlformats.org/officeDocument/2006/math" xmlns:v="urn:schemas-microsoft-com:vml" xmlns:wp14="http://schemas.microsoft.com/office/word/2010/wordprocessingDrawing" xmlns:wp="http://schemas.openxmlformats.org/drawingml/2006/wordprocessingDrawing" xmlns:w10="urn:schemas-microsoft-com:office:word" xmlns:w="http://schemas.openxmlformats.org/wordprocessingml/2006/main" xmlns:w14="http://schemas.microsoft.com/office/word/2010/wordml" xmlns:w15="http://schemas.microsoft.com/office/word/2012/wordml" xmlns:w16cex="http://schemas.microsoft.com/office/word/2018/wordml/cex" xmlns:w16cid="http://schemas.microsoft.com/office/word/2016/wordml/cid" xmlns:w16="http://schemas.microsoft.com/office/word/2018/wordml" xmlns:w16du="http://schemas.microsoft.com/office/word/2023/wordml/word16du" xmlns:w16sdtdh="http://schemas.microsoft.com/office/word/2020/wordml/sdtdatahash" xmlns:w16se="http://schemas.microsoft.com/office/word/2015/wordml/symex" xmlns:wpg="http://schemas.microsoft.com/office/word/2010/wordprocessingGroup" xmlns:wpi="http://schemas.microsoft.com/office/word/2010/wordprocessingInk" xmlns:wne="http://schemas.microsoft.com/office/word/2006/wordml" xmlns:wps="http://schemas.microsoft.com/office/word/2010/wordprocessingShape" mc:Ignorable="w14 w15 w16se w16cid w16 w16cex w16sdtdh w16du wp14">
   <w:p>
     <w:pPr>
       <w:pStyle w:val="Title"/>
@@ -2315,43 +1533,7 @@
                               <w:color w:val="FFFFFF" w:themeColor="background1"/>
                               <w:sz w:val="16"/>
                             </w:rPr>
-                            <w:t xml:space="preserve">Made on </w:t>
-                          </w:r>
-                          <w:proofErr w:type="gramStart"/>
-                          <w:r>
-                            <w:rPr>
-                              <w:rFonts w:asciiTheme="majorHAnsi" w:hAnsiTheme="majorHAnsi" w:cstheme="majorHAnsi"/>
-                              <w:color w:val="FFFFFF" w:themeColor="background1"/>
-                              <w:sz w:val="16"/>
-                            </w:rPr>
-                            <w:t>{{ today</w:t>
-                          </w:r>
-                          <w:proofErr w:type="gramEnd"/>
-                          <w:r>
-                            <w:rPr>
-                              <w:rFonts w:asciiTheme="majorHAnsi" w:hAnsiTheme="majorHAnsi" w:cstheme="majorHAnsi"/>
-                              <w:color w:val="FFFFFF" w:themeColor="background1"/>
-                              <w:sz w:val="16"/>
-                            </w:rPr>
-                            <w:t>(</w:t>
-                          </w:r>
-                          <w:proofErr w:type="gramStart"/>
-                          <w:r>
-                            <w:rPr>
-                              <w:rFonts w:asciiTheme="majorHAnsi" w:hAnsiTheme="majorHAnsi" w:cstheme="majorHAnsi"/>
-                              <w:color w:val="FFFFFF" w:themeColor="background1"/>
-                              <w:sz w:val="16"/>
-                            </w:rPr>
-                            <w:t>) }</w:t>
-                          </w:r>
-                          <w:proofErr w:type="gramEnd"/>
-                          <w:r>
-                            <w:rPr>
-                              <w:rFonts w:asciiTheme="majorHAnsi" w:hAnsiTheme="majorHAnsi" w:cstheme="majorHAnsi"/>
-                              <w:color w:val="FFFFFF" w:themeColor="background1"/>
-                              <w:sz w:val="16"/>
-                            </w:rPr>
-                            <w:t>}</w:t>
+                            <w:t>Made on {{ today() }}</w:t>
                           </w:r>
                         </w:p>
                       </w:txbxContent>
@@ -2371,13 +1553,13 @@
             </wp:anchor>
           </w:drawing>
         </mc:Choice>
-        <mc:Fallback>
+        <mc:Fallback xmlns:w16sdtfl="http://schemas.microsoft.com/office/word/2024/wordml/sdtformatlock">
           <w:pict>
             <v:shapetype w14:anchorId="7ABC264D" id="_x0000_t202" coordsize="21600,21600" o:spt="202" path="m,l,21600r21600,l21600,xe">
               <v:stroke joinstyle="miter"/>
               <v:path gradientshapeok="t" o:connecttype="rect"/>
             </v:shapetype>
-            <v:shape id="Text Box 1" o:spid="_x0000_s1026" type="#_x0000_t202" style="position:absolute;margin-left:141.95pt;margin-top:-6.75pt;width:408pt;height:48.55pt;z-index:251664384;visibility:visible;mso-wrap-style:square;mso-height-percent:0;mso-wrap-distance-left:9pt;mso-wrap-distance-top:0;mso-wrap-distance-right:9pt;mso-wrap-distance-bottom:0;mso-position-horizontal:absolute;mso-position-horizontal-relative:text;mso-position-vertical:absolute;mso-position-vertical-relative:text;mso-height-percent:0;mso-height-relative:margin;v-text-anchor:top" o:gfxdata="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" filled="f" stroked="f" strokeweight=".5pt">
+            <v:shape id="Text Box 1" o:spid="_x0000_s1026" type="#_x0000_t202" style="position:absolute;margin-left:141.95pt;margin-top:-6.75pt;width:408pt;height:48.55pt;z-index:251664384;visibility:visible;mso-wrap-style:square;mso-height-percent:0;mso-wrap-distance-left:9pt;mso-wrap-distance-top:0;mso-wrap-distance-right:9pt;mso-wrap-distance-bottom:0;mso-position-horizontal:absolute;mso-position-horizontal-relative:text;mso-position-vertical:absolute;mso-position-vertical-relative:text;mso-height-percent:0;mso-height-relative:margin;v-text-anchor:top" o:gfxdata="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" filled="f" stroked="f" strokeweight=".5pt">
               <v:textbox>
                 <w:txbxContent>
                   <w:p>
@@ -2556,9 +1738,9 @@
             </wp:anchor>
           </w:drawing>
         </mc:Choice>
-        <mc:Fallback>
+        <mc:Fallback xmlns:w16sdtfl="http://schemas.microsoft.com/office/word/2024/wordml/sdtformatlock">
           <w:pict>
-            <v:rect w14:anchorId="42B046C4" id="Rectangle 2" o:spid="_x0000_s1026" style="position:absolute;margin-left:0;margin-top:0;width:611.3pt;height:88.8pt;z-index:-251653120;visibility:visible;mso-wrap-style:square;mso-width-percent:0;mso-height-percent:0;mso-wrap-distance-left:.5pt;mso-wrap-distance-top:.55pt;mso-wrap-distance-right:.5pt;mso-wrap-distance-bottom:.45pt;mso-position-horizontal:left;mso-position-horizontal-relative:page;mso-position-vertical:top;mso-position-vertical-relative:page;mso-width-percent:0;mso-height-percent:0;mso-width-relative:page;mso-height-relative:page;v-text-anchor:top" o:gfxdata="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" o:allowincell="f" fillcolor="#1a73e8" strokecolor="#1355ab" strokeweight="1pt">
+            <v:rect w14:anchorId="42B046C4" id="Rectangle 2" o:spid="_x0000_s1026" style="position:absolute;margin-left:0;margin-top:0;width:611.3pt;height:88.8pt;z-index:-251653120;visibility:visible;mso-wrap-style:square;mso-width-percent:0;mso-height-percent:0;mso-wrap-distance-left:.5pt;mso-wrap-distance-top:.55pt;mso-wrap-distance-right:.5pt;mso-wrap-distance-bottom:.45pt;mso-position-horizontal:left;mso-position-horizontal-relative:page;mso-position-vertical:top;mso-position-vertical-relative:page;mso-width-percent:0;mso-height-percent:0;mso-width-relative:page;mso-height-relative:page;v-text-anchor:top" o:gfxdata="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" o:allowincell="f" fillcolor="#1a73e8" strokecolor="#1355ab" strokeweight="1pt">
               <v:path arrowok="t"/>
               <w10:wrap anchorx="page" anchory="page"/>
             </v:rect>
@@ -2627,7 +1809,7 @@
 </file>
 
 <file path=word/header3.xml><?xml version="1.0" encoding="utf-8"?>
-<w:hdr xmlns:wpc="http://schemas.microsoft.com/office/word/2010/wordprocessingCanvas" xmlns:cx="http://schemas.microsoft.com/office/drawing/2014/chartex" xmlns:cx1="http://schemas.microsoft.com/office/drawing/2015/9/8/chartex" xmlns:cx2="http://schemas.microsoft.com/office/drawing/2015/10/21/chartex" xmlns:cx3="http://schemas.microsoft.com/office/drawing/2016/5/9/chartex" xmlns:cx4="http://schemas.microsoft.com/office/drawing/2016/5/10/chartex" xmlns:cx5="http://schemas.microsoft.com/office/drawing/2016/5/11/chartex" xmlns:cx6="http://schemas.microsoft.com/office/drawing/2016/5/12/chartex" xmlns:cx7="http://schemas.microsoft.com/office/drawing/2016/5/13/chartex" xmlns:cx8="http://schemas.microsoft.com/office/drawing/2016/5/14/chartex" xmlns:mc="http://schemas.openxmlformats.org/markup-compatibility/2006" xmlns:aink="http://schemas.microsoft.com/office/drawing/2016/ink" xmlns:am3d="http://schemas.microsoft.com/office/drawing/2017/model3d" xmlns:o="urn:schemas-microsoft-com:office:office" xmlns:oel="http://schemas.microsoft.com/office/2019/extlst" xmlns:r="http://schemas.openxmlformats.org/officeDocument/2006/relationships" xmlns:m="http://schemas.openxmlformats.org/officeDocument/2006/math" xmlns:v="urn:schemas-microsoft-com:vml" xmlns:wp14="http://schemas.microsoft.com/office/word/2010/wordprocessingDrawing" xmlns:wp="http://schemas.openxmlformats.org/drawingml/2006/wordprocessingDrawing" xmlns:w10="urn:schemas-microsoft-com:office:word" xmlns:w="http://schemas.openxmlformats.org/wordprocessingml/2006/main" xmlns:w14="http://schemas.microsoft.com/office/word/2010/wordml" xmlns:w15="http://schemas.microsoft.com/office/word/2012/wordml" xmlns:w16cex="http://schemas.microsoft.com/office/word/2018/wordml/cex" xmlns:w16cid="http://schemas.microsoft.com/office/word/2016/wordml/cid" xmlns:w16="http://schemas.microsoft.com/office/word/2018/wordml" xmlns:w16du="http://schemas.microsoft.com/office/word/2023/wordml/word16du" xmlns:w16sdtdh="http://schemas.microsoft.com/office/word/2020/wordml/sdtdatahash" xmlns:w16sdtfl="http://schemas.microsoft.com/office/word/2024/wordml/sdtformatlock" xmlns:w16se="http://schemas.microsoft.com/office/word/2015/wordml/symex" xmlns:wpg="http://schemas.microsoft.com/office/word/2010/wordprocessingGroup" xmlns:wpi="http://schemas.microsoft.com/office/word/2010/wordprocessingInk" xmlns:wne="http://schemas.microsoft.com/office/word/2006/wordml" xmlns:wps="http://schemas.microsoft.com/office/word/2010/wordprocessingShape" mc:Ignorable="w14 w15 w16se w16cid w16 w16cex w16sdtdh w16sdtfl w16du wp14">
+<w:hdr xmlns:wpc="http://schemas.microsoft.com/office/word/2010/wordprocessingCanvas" xmlns:cx="http://schemas.microsoft.com/office/drawing/2014/chartex" xmlns:cx1="http://schemas.microsoft.com/office/drawing/2015/9/8/chartex" xmlns:cx2="http://schemas.microsoft.com/office/drawing/2015/10/21/chartex" xmlns:cx3="http://schemas.microsoft.com/office/drawing/2016/5/9/chartex" xmlns:cx4="http://schemas.microsoft.com/office/drawing/2016/5/10/chartex" xmlns:cx5="http://schemas.microsoft.com/office/drawing/2016/5/11/chartex" xmlns:cx6="http://schemas.microsoft.com/office/drawing/2016/5/12/chartex" xmlns:cx7="http://schemas.microsoft.com/office/drawing/2016/5/13/chartex" xmlns:cx8="http://schemas.microsoft.com/office/drawing/2016/5/14/chartex" xmlns:mc="http://schemas.openxmlformats.org/markup-compatibility/2006" xmlns:aink="http://schemas.microsoft.com/office/drawing/2016/ink" xmlns:am3d="http://schemas.microsoft.com/office/drawing/2017/model3d" xmlns:o="urn:schemas-microsoft-com:office:office" xmlns:oel="http://schemas.microsoft.com/office/2019/extlst" xmlns:r="http://schemas.openxmlformats.org/officeDocument/2006/relationships" xmlns:m="http://schemas.openxmlformats.org/officeDocument/2006/math" xmlns:v="urn:schemas-microsoft-com:vml" xmlns:wp14="http://schemas.microsoft.com/office/word/2010/wordprocessingDrawing" xmlns:wp="http://schemas.openxmlformats.org/drawingml/2006/wordprocessingDrawing" xmlns:w10="urn:schemas-microsoft-com:office:word" xmlns:w="http://schemas.openxmlformats.org/wordprocessingml/2006/main" xmlns:w14="http://schemas.microsoft.com/office/word/2010/wordml" xmlns:w15="http://schemas.microsoft.com/office/word/2012/wordml" xmlns:w16cex="http://schemas.microsoft.com/office/word/2018/wordml/cex" xmlns:w16cid="http://schemas.microsoft.com/office/word/2016/wordml/cid" xmlns:w16="http://schemas.microsoft.com/office/word/2018/wordml" xmlns:w16du="http://schemas.microsoft.com/office/word/2023/wordml/word16du" xmlns:w16sdtdh="http://schemas.microsoft.com/office/word/2020/wordml/sdtdatahash" xmlns:w16se="http://schemas.microsoft.com/office/word/2015/wordml/symex" xmlns:wpg="http://schemas.microsoft.com/office/word/2010/wordprocessingGroup" xmlns:wpi="http://schemas.microsoft.com/office/word/2010/wordprocessingInk" xmlns:wne="http://schemas.microsoft.com/office/word/2006/wordml" xmlns:wps="http://schemas.microsoft.com/office/word/2010/wordprocessingShape" mc:Ignorable="w14 w15 w16se w16cid w16 w16cex w16sdtdh w16du wp14">
   <w:p>
     <w:pPr>
       <w:pStyle w:val="Header"/>
@@ -2637,7 +1819,7 @@
 </file>
 
 <file path=word/header4.xml><?xml version="1.0" encoding="utf-8"?>
-<w:hdr xmlns:wpc="http://schemas.microsoft.com/office/word/2010/wordprocessingCanvas" xmlns:cx="http://schemas.microsoft.com/office/drawing/2014/chartex" xmlns:cx1="http://schemas.microsoft.com/office/drawing/2015/9/8/chartex" xmlns:cx2="http://schemas.microsoft.com/office/drawing/2015/10/21/chartex" xmlns:cx3="http://schemas.microsoft.com/office/drawing/2016/5/9/chartex" xmlns:cx4="http://schemas.microsoft.com/office/drawing/2016/5/10/chartex" xmlns:cx5="http://schemas.microsoft.com/office/drawing/2016/5/11/chartex" xmlns:cx6="http://schemas.microsoft.com/office/drawing/2016/5/12/chartex" xmlns:cx7="http://schemas.microsoft.com/office/drawing/2016/5/13/chartex" xmlns:cx8="http://schemas.microsoft.com/office/drawing/2016/5/14/chartex" xmlns:mc="http://schemas.openxmlformats.org/markup-compatibility/2006" xmlns:aink="http://schemas.microsoft.com/office/drawing/2016/ink" xmlns:am3d="http://schemas.microsoft.com/office/drawing/2017/model3d" xmlns:o="urn:schemas-microsoft-com:office:office" xmlns:oel="http://schemas.microsoft.com/office/2019/extlst" xmlns:r="http://schemas.openxmlformats.org/officeDocument/2006/relationships" xmlns:m="http://schemas.openxmlformats.org/officeDocument/2006/math" xmlns:v="urn:schemas-microsoft-com:vml" xmlns:wp14="http://schemas.microsoft.com/office/word/2010/wordprocessingDrawing" xmlns:wp="http://schemas.openxmlformats.org/drawingml/2006/wordprocessingDrawing" xmlns:w10="urn:schemas-microsoft-com:office:word" xmlns:w="http://schemas.openxmlformats.org/wordprocessingml/2006/main" xmlns:w14="http://schemas.microsoft.com/office/word/2010/wordml" xmlns:w15="http://schemas.microsoft.com/office/word/2012/wordml" xmlns:w16cex="http://schemas.microsoft.com/office/word/2018/wordml/cex" xmlns:w16cid="http://schemas.microsoft.com/office/word/2016/wordml/cid" xmlns:w16="http://schemas.microsoft.com/office/word/2018/wordml" xmlns:w16du="http://schemas.microsoft.com/office/word/2023/wordml/word16du" xmlns:w16sdtdh="http://schemas.microsoft.com/office/word/2020/wordml/sdtdatahash" xmlns:w16sdtfl="http://schemas.microsoft.com/office/word/2024/wordml/sdtformatlock" xmlns:w16se="http://schemas.microsoft.com/office/word/2015/wordml/symex" xmlns:wpg="http://schemas.microsoft.com/office/word/2010/wordprocessingGroup" xmlns:wpi="http://schemas.microsoft.com/office/word/2010/wordprocessingInk" xmlns:wne="http://schemas.microsoft.com/office/word/2006/wordml" xmlns:wps="http://schemas.microsoft.com/office/word/2010/wordprocessingShape" mc:Ignorable="w14 w15 w16se w16cid w16 w16cex w16sdtdh w16sdtfl w16du wp14">
+<w:hdr xmlns:wpc="http://schemas.microsoft.com/office/word/2010/wordprocessingCanvas" xmlns:cx="http://schemas.microsoft.com/office/drawing/2014/chartex" xmlns:cx1="http://schemas.microsoft.com/office/drawing/2015/9/8/chartex" xmlns:cx2="http://schemas.microsoft.com/office/drawing/2015/10/21/chartex" xmlns:cx3="http://schemas.microsoft.com/office/drawing/2016/5/9/chartex" xmlns:cx4="http://schemas.microsoft.com/office/drawing/2016/5/10/chartex" xmlns:cx5="http://schemas.microsoft.com/office/drawing/2016/5/11/chartex" xmlns:cx6="http://schemas.microsoft.com/office/drawing/2016/5/12/chartex" xmlns:cx7="http://schemas.microsoft.com/office/drawing/2016/5/13/chartex" xmlns:cx8="http://schemas.microsoft.com/office/drawing/2016/5/14/chartex" xmlns:mc="http://schemas.openxmlformats.org/markup-compatibility/2006" xmlns:aink="http://schemas.microsoft.com/office/drawing/2016/ink" xmlns:am3d="http://schemas.microsoft.com/office/drawing/2017/model3d" xmlns:o="urn:schemas-microsoft-com:office:office" xmlns:oel="http://schemas.microsoft.com/office/2019/extlst" xmlns:r="http://schemas.openxmlformats.org/officeDocument/2006/relationships" xmlns:m="http://schemas.openxmlformats.org/officeDocument/2006/math" xmlns:v="urn:schemas-microsoft-com:vml" xmlns:wp14="http://schemas.microsoft.com/office/word/2010/wordprocessingDrawing" xmlns:wp="http://schemas.openxmlformats.org/drawingml/2006/wordprocessingDrawing" xmlns:w10="urn:schemas-microsoft-com:office:word" xmlns:w="http://schemas.openxmlformats.org/wordprocessingml/2006/main" xmlns:w14="http://schemas.microsoft.com/office/word/2010/wordml" xmlns:w15="http://schemas.microsoft.com/office/word/2012/wordml" xmlns:w16cex="http://schemas.microsoft.com/office/word/2018/wordml/cex" xmlns:w16cid="http://schemas.microsoft.com/office/word/2016/wordml/cid" xmlns:w16="http://schemas.microsoft.com/office/word/2018/wordml" xmlns:w16du="http://schemas.microsoft.com/office/word/2023/wordml/word16du" xmlns:w16sdtdh="http://schemas.microsoft.com/office/word/2020/wordml/sdtdatahash" xmlns:w16se="http://schemas.microsoft.com/office/word/2015/wordml/symex" xmlns:wpg="http://schemas.microsoft.com/office/word/2010/wordprocessingGroup" xmlns:wpi="http://schemas.microsoft.com/office/word/2010/wordprocessingInk" xmlns:wne="http://schemas.microsoft.com/office/word/2006/wordml" xmlns:wps="http://schemas.microsoft.com/office/word/2010/wordprocessingShape" mc:Ignorable="w14 w15 w16se w16cid w16 w16cex w16sdtdh w16du wp14">
   <w:p>
     <w:pPr>
       <w:pStyle w:val="Title"/>
@@ -2779,43 +1961,7 @@
                               <w:color w:val="FFFFFF" w:themeColor="background1"/>
                               <w:sz w:val="16"/>
                             </w:rPr>
-                            <w:t xml:space="preserve">Made on </w:t>
-                          </w:r>
-                          <w:proofErr w:type="gramStart"/>
-                          <w:r>
-                            <w:rPr>
-                              <w:rFonts w:asciiTheme="majorHAnsi" w:hAnsiTheme="majorHAnsi" w:cstheme="majorHAnsi"/>
-                              <w:color w:val="FFFFFF" w:themeColor="background1"/>
-                              <w:sz w:val="16"/>
-                            </w:rPr>
-                            <w:t>{{ today</w:t>
-                          </w:r>
-                          <w:proofErr w:type="gramEnd"/>
-                          <w:r>
-                            <w:rPr>
-                              <w:rFonts w:asciiTheme="majorHAnsi" w:hAnsiTheme="majorHAnsi" w:cstheme="majorHAnsi"/>
-                              <w:color w:val="FFFFFF" w:themeColor="background1"/>
-                              <w:sz w:val="16"/>
-                            </w:rPr>
-                            <w:t>(</w:t>
-                          </w:r>
-                          <w:proofErr w:type="gramStart"/>
-                          <w:r>
-                            <w:rPr>
-                              <w:rFonts w:asciiTheme="majorHAnsi" w:hAnsiTheme="majorHAnsi" w:cstheme="majorHAnsi"/>
-                              <w:color w:val="FFFFFF" w:themeColor="background1"/>
-                              <w:sz w:val="16"/>
-                            </w:rPr>
-                            <w:t>) }</w:t>
-                          </w:r>
-                          <w:proofErr w:type="gramEnd"/>
-                          <w:r>
-                            <w:rPr>
-                              <w:rFonts w:asciiTheme="majorHAnsi" w:hAnsiTheme="majorHAnsi" w:cstheme="majorHAnsi"/>
-                              <w:color w:val="FFFFFF" w:themeColor="background1"/>
-                              <w:sz w:val="16"/>
-                            </w:rPr>
-                            <w:t>}</w:t>
+                            <w:t>Made on {{ today() }}</w:t>
                           </w:r>
                         </w:p>
                       </w:txbxContent>
@@ -2835,13 +1981,13 @@
             </wp:anchor>
           </w:drawing>
         </mc:Choice>
-        <mc:Fallback>
+        <mc:Fallback xmlns:w16sdtfl="http://schemas.microsoft.com/office/word/2024/wordml/sdtformatlock">
           <w:pict>
             <v:shapetype w14:anchorId="5FB366E4" id="_x0000_t202" coordsize="21600,21600" o:spt="202" path="m,l,21600r21600,l21600,xe">
               <v:stroke joinstyle="miter"/>
               <v:path gradientshapeok="t" o:connecttype="rect"/>
             </v:shapetype>
-            <v:shape id="Text Box 1" o:spid="_x0000_s1026" type="#_x0000_t202" style="position:absolute;left:0;text-align:left;margin-left:141.95pt;margin-top:-6.75pt;width:408pt;height:48.55pt;z-index:251661312;visibility:visible;mso-wrap-style:square;mso-height-percent:0;mso-wrap-distance-left:9pt;mso-wrap-distance-top:0;mso-wrap-distance-right:9pt;mso-wrap-distance-bottom:0;mso-position-horizontal:absolute;mso-position-horizontal-relative:text;mso-position-vertical:absolute;mso-position-vertical-relative:text;mso-height-percent:0;mso-height-relative:margin;v-text-anchor:top" o:gfxdata="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" filled="f" stroked="f" strokeweight=".5pt">
+            <v:shape id="Text Box 1" o:spid="_x0000_s1026" type="#_x0000_t202" style="position:absolute;left:0;text-align:left;margin-left:141.95pt;margin-top:-6.75pt;width:408pt;height:48.55pt;z-index:251661312;visibility:visible;mso-wrap-style:square;mso-height-percent:0;mso-wrap-distance-left:9pt;mso-wrap-distance-top:0;mso-wrap-distance-right:9pt;mso-wrap-distance-bottom:0;mso-position-horizontal:absolute;mso-position-horizontal-relative:text;mso-position-vertical:absolute;mso-position-vertical-relative:text;mso-height-percent:0;mso-height-relative:margin;v-text-anchor:top" o:gfxdata="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" filled="f" stroked="f" strokeweight=".5pt">
               <v:textbox>
                 <w:txbxContent>
                   <w:p>
@@ -3048,7 +2194,7 @@
             </wp:anchor>
           </w:drawing>
         </mc:Choice>
-        <mc:Fallback>
+        <mc:Fallback xmlns:w16sdtfl="http://schemas.microsoft.com/office/word/2024/wordml/sdtformatlock">
           <w:pict>
             <v:rect w14:anchorId="33EBEFD5" id="Rectangle 2" o:spid="_x0000_s1026" style="position:absolute;margin-left:0;margin-top:0;width:611.3pt;height:88.8pt;z-index:-251657216;visibility:visible;mso-wrap-style:square;mso-width-percent:0;mso-height-percent:0;mso-wrap-distance-left:.5pt;mso-wrap-distance-top:.55pt;mso-wrap-distance-right:.5pt;mso-wrap-distance-bottom:.45pt;mso-position-horizontal:left;mso-position-horizontal-relative:page;mso-position-vertical:top;mso-position-vertical-relative:page;mso-width-percent:0;mso-height-percent:0;mso-width-relative:page;mso-height-relative:page;v-text-anchor:top" o:gfxdata="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" o:allowincell="f" fillcolor="#1a73e8" strokecolor="#1355ab" strokeweight="1pt">
               <v:path arrowok="t"/>
@@ -3115,7 +2261,7 @@
 </file>
 
 <file path=word/numbering.xml><?xml version="1.0" encoding="utf-8"?>
-<w:numbering xmlns:wpc="http://schemas.microsoft.com/office/word/2010/wordprocessingCanvas" xmlns:cx="http://schemas.microsoft.com/office/drawing/2014/chartex" xmlns:cx1="http://schemas.microsoft.com/office/drawing/2015/9/8/chartex" xmlns:cx2="http://schemas.microsoft.com/office/drawing/2015/10/21/chartex" xmlns:cx3="http://schemas.microsoft.com/office/drawing/2016/5/9/chartex" xmlns:cx4="http://schemas.microsoft.com/office/drawing/2016/5/10/chartex" xmlns:cx5="http://schemas.microsoft.com/office/drawing/2016/5/11/chartex" xmlns:cx6="http://schemas.microsoft.com/office/drawing/2016/5/12/chartex" xmlns:cx7="http://schemas.microsoft.com/office/drawing/2016/5/13/chartex" xmlns:cx8="http://schemas.microsoft.com/office/drawing/2016/5/14/chartex" xmlns:mc="http://schemas.openxmlformats.org/markup-compatibility/2006" xmlns:aink="http://schemas.microsoft.com/office/drawing/2016/ink" xmlns:am3d="http://schemas.microsoft.com/office/drawing/2017/model3d" xmlns:o="urn:schemas-microsoft-com:office:office" xmlns:oel="http://schemas.microsoft.com/office/2019/extlst" xmlns:r="http://schemas.openxmlformats.org/officeDocument/2006/relationships" xmlns:m="http://schemas.openxmlformats.org/officeDocument/2006/math" xmlns:v="urn:schemas-microsoft-com:vml" xmlns:wp14="http://schemas.microsoft.com/office/word/2010/wordprocessingDrawing" xmlns:wp="http://schemas.openxmlformats.org/drawingml/2006/wordprocessingDrawing" xmlns:w10="urn:schemas-microsoft-com:office:word" xmlns:w="http://schemas.openxmlformats.org/wordprocessingml/2006/main" xmlns:w14="http://schemas.microsoft.com/office/word/2010/wordml" xmlns:w15="http://schemas.microsoft.com/office/word/2012/wordml" xmlns:w16cex="http://schemas.microsoft.com/office/word/2018/wordml/cex" xmlns:w16cid="http://schemas.microsoft.com/office/word/2016/wordml/cid" xmlns:w16="http://schemas.microsoft.com/office/word/2018/wordml" xmlns:w16du="http://schemas.microsoft.com/office/word/2023/wordml/word16du" xmlns:w16sdtdh="http://schemas.microsoft.com/office/word/2020/wordml/sdtdatahash" xmlns:w16sdtfl="http://schemas.microsoft.com/office/word/2024/wordml/sdtformatlock" xmlns:w16se="http://schemas.microsoft.com/office/word/2015/wordml/symex" xmlns:wpg="http://schemas.microsoft.com/office/word/2010/wordprocessingGroup" xmlns:wpi="http://schemas.microsoft.com/office/word/2010/wordprocessingInk" xmlns:wne="http://schemas.microsoft.com/office/word/2006/wordml" xmlns:wps="http://schemas.microsoft.com/office/word/2010/wordprocessingShape" mc:Ignorable="w14 w15 w16se w16cid w16 w16cex w16sdtdh w16sdtfl w16du wp14">
+<w:numbering xmlns:wpc="http://schemas.microsoft.com/office/word/2010/wordprocessingCanvas" xmlns:cx="http://schemas.microsoft.com/office/drawing/2014/chartex" xmlns:cx1="http://schemas.microsoft.com/office/drawing/2015/9/8/chartex" xmlns:cx2="http://schemas.microsoft.com/office/drawing/2015/10/21/chartex" xmlns:cx3="http://schemas.microsoft.com/office/drawing/2016/5/9/chartex" xmlns:cx4="http://schemas.microsoft.com/office/drawing/2016/5/10/chartex" xmlns:cx5="http://schemas.microsoft.com/office/drawing/2016/5/11/chartex" xmlns:cx6="http://schemas.microsoft.com/office/drawing/2016/5/12/chartex" xmlns:cx7="http://schemas.microsoft.com/office/drawing/2016/5/13/chartex" xmlns:cx8="http://schemas.microsoft.com/office/drawing/2016/5/14/chartex" xmlns:mc="http://schemas.openxmlformats.org/markup-compatibility/2006" xmlns:aink="http://schemas.microsoft.com/office/drawing/2016/ink" xmlns:am3d="http://schemas.microsoft.com/office/drawing/2017/model3d" xmlns:o="urn:schemas-microsoft-com:office:office" xmlns:oel="http://schemas.microsoft.com/office/2019/extlst" xmlns:r="http://schemas.openxmlformats.org/officeDocument/2006/relationships" xmlns:m="http://schemas.openxmlformats.org/officeDocument/2006/math" xmlns:v="urn:schemas-microsoft-com:vml" xmlns:wp14="http://schemas.microsoft.com/office/word/2010/wordprocessingDrawing" xmlns:wp="http://schemas.openxmlformats.org/drawingml/2006/wordprocessingDrawing" xmlns:w10="urn:schemas-microsoft-com:office:word" xmlns:w="http://schemas.openxmlformats.org/wordprocessingml/2006/main" xmlns:w14="http://schemas.microsoft.com/office/word/2010/wordml" xmlns:w15="http://schemas.microsoft.com/office/word/2012/wordml" xmlns:w16cex="http://schemas.microsoft.com/office/word/2018/wordml/cex" xmlns:w16cid="http://schemas.microsoft.com/office/word/2016/wordml/cid" xmlns:w16="http://schemas.microsoft.com/office/word/2018/wordml" xmlns:w16du="http://schemas.microsoft.com/office/word/2023/wordml/word16du" xmlns:w16sdtdh="http://schemas.microsoft.com/office/word/2020/wordml/sdtdatahash" xmlns:w16se="http://schemas.microsoft.com/office/word/2015/wordml/symex" xmlns:wpg="http://schemas.microsoft.com/office/word/2010/wordprocessingGroup" xmlns:wpi="http://schemas.microsoft.com/office/word/2010/wordprocessingInk" xmlns:wne="http://schemas.microsoft.com/office/word/2006/wordml" xmlns:wps="http://schemas.microsoft.com/office/word/2010/wordprocessingShape" mc:Ignorable="w14 w15 w16se w16cid w16 w16cex w16sdtdh w16du wp14">
   <w:abstractNum w:abstractNumId="0" w15:restartNumberingAfterBreak="0">
     <w:nsid w:val="013B73B9"/>
     <w:multiLevelType w:val="hybridMultilevel"/>
@@ -5035,7 +4181,7 @@
 </file>
 
 <file path=word/styles.xml><?xml version="1.0" encoding="utf-8"?>
-<w:styles xmlns:mc="http://schemas.openxmlformats.org/markup-compatibility/2006" xmlns:r="http://schemas.openxmlformats.org/officeDocument/2006/relationships" xmlns:w="http://schemas.openxmlformats.org/wordprocessingml/2006/main" xmlns:w14="http://schemas.microsoft.com/office/word/2010/wordml" xmlns:w15="http://schemas.microsoft.com/office/word/2012/wordml" xmlns:w16cex="http://schemas.microsoft.com/office/word/2018/wordml/cex" xmlns:w16cid="http://schemas.microsoft.com/office/word/2016/wordml/cid" xmlns:w16="http://schemas.microsoft.com/office/word/2018/wordml" xmlns:w16du="http://schemas.microsoft.com/office/word/2023/wordml/word16du" xmlns:w16sdtdh="http://schemas.microsoft.com/office/word/2020/wordml/sdtdatahash" xmlns:w16sdtfl="http://schemas.microsoft.com/office/word/2024/wordml/sdtformatlock" xmlns:w16se="http://schemas.microsoft.com/office/word/2015/wordml/symex" mc:Ignorable="w14 w15 w16se w16cid w16 w16cex w16sdtdh w16sdtfl w16du">
+<w:styles xmlns:mc="http://schemas.openxmlformats.org/markup-compatibility/2006" xmlns:r="http://schemas.openxmlformats.org/officeDocument/2006/relationships" xmlns:w="http://schemas.openxmlformats.org/wordprocessingml/2006/main" xmlns:w14="http://schemas.microsoft.com/office/word/2010/wordml" xmlns:w15="http://schemas.microsoft.com/office/word/2012/wordml" xmlns:w16cex="http://schemas.microsoft.com/office/word/2018/wordml/cex" xmlns:w16cid="http://schemas.microsoft.com/office/word/2016/wordml/cid" xmlns:w16="http://schemas.microsoft.com/office/word/2018/wordml" xmlns:w16du="http://schemas.microsoft.com/office/word/2023/wordml/word16du" xmlns:w16sdtdh="http://schemas.microsoft.com/office/word/2020/wordml/sdtdatahash" xmlns:w16se="http://schemas.microsoft.com/office/word/2015/wordml/symex" mc:Ignorable="w14 w15 w16se w16cid w16 w16cex w16sdtdh w16du">
   <w:docDefaults>
     <w:rPrDefault>
       <w:rPr>

</xml_diff>